<commit_message>
add import and rotate data from goszakupki.by
</commit_message>
<xml_diff>
--- a/doc/Тех_задание_ГПЗ.docx
+++ b/doc/Тех_задание_ГПЗ.docx
@@ -55,7 +55,6 @@
         </w:rPr>
         <w:t xml:space="preserve">) на </w:t>
       </w:r>
-      <w:proofErr w:type="spellStart"/>
       <w:r>
         <w:rPr>
           <w:rFonts w:ascii="Times New Roman" w:hAnsi="Times New Roman" w:cs="Times New Roman"/>
@@ -86,16 +85,7 @@
           <w:sz w:val="30"/>
           <w:szCs w:val="30"/>
         </w:rPr>
-        <w:t>eact</w:t>
-      </w:r>
-      <w:proofErr w:type="spellEnd"/>
-      <w:r>
-        <w:rPr>
-          <w:rFonts w:ascii="Times New Roman" w:hAnsi="Times New Roman" w:cs="Times New Roman"/>
-          <w:sz w:val="30"/>
-          <w:szCs w:val="30"/>
-        </w:rPr>
-        <w:t xml:space="preserve"> TS</w:t>
+        <w:t>eact TS</w:t>
       </w:r>
       <w:r>
         <w:rPr>
@@ -211,7 +201,6 @@
         </w:rPr>
         <w:t xml:space="preserve">с сайта </w:t>
       </w:r>
-      <w:proofErr w:type="spellStart"/>
       <w:r>
         <w:rPr>
           <w:rFonts w:ascii="Times New Roman" w:hAnsi="Times New Roman" w:cs="Times New Roman"/>
@@ -221,7 +210,6 @@
         </w:rPr>
         <w:t>goszakupki</w:t>
       </w:r>
-      <w:proofErr w:type="spellEnd"/>
       <w:r>
         <w:rPr>
           <w:rFonts w:ascii="Times New Roman" w:hAnsi="Times New Roman" w:cs="Times New Roman"/>
@@ -274,7 +262,6 @@
         </w:rPr>
         <w:t xml:space="preserve">для опубликования на </w:t>
       </w:r>
-      <w:proofErr w:type="spellStart"/>
       <w:r>
         <w:rPr>
           <w:rFonts w:ascii="Times New Roman" w:hAnsi="Times New Roman" w:cs="Times New Roman"/>
@@ -284,7 +271,6 @@
         </w:rPr>
         <w:t>goszakupki</w:t>
       </w:r>
-      <w:proofErr w:type="spellEnd"/>
       <w:r>
         <w:rPr>
           <w:rFonts w:ascii="Times New Roman" w:hAnsi="Times New Roman" w:cs="Times New Roman"/>
@@ -410,47 +396,7 @@
           <w:szCs w:val="30"/>
           <w:lang w:val="ru-BY"/>
         </w:rPr>
-        <w:t xml:space="preserve">Хранение истории </w:t>
-      </w:r>
-      <w:proofErr w:type="spellStart"/>
-      <w:r>
-        <w:rPr>
-          <w:rFonts w:ascii="Times New Roman" w:hAnsi="Times New Roman" w:cs="Times New Roman"/>
-          <w:sz w:val="30"/>
-          <w:szCs w:val="30"/>
-          <w:lang w:val="ru-BY"/>
-        </w:rPr>
-        <w:t>коректирвок</w:t>
-      </w:r>
-      <w:proofErr w:type="spellEnd"/>
-      <w:r>
-        <w:rPr>
-          <w:rFonts w:ascii="Times New Roman" w:hAnsi="Times New Roman" w:cs="Times New Roman"/>
-          <w:sz w:val="30"/>
-          <w:szCs w:val="30"/>
-          <w:lang w:val="ru-BY"/>
-        </w:rPr>
-        <w:t xml:space="preserve"> перераспределения между статьями, увеличение или уменьшение </w:t>
-      </w:r>
-      <w:proofErr w:type="spellStart"/>
-      <w:r>
-        <w:rPr>
-          <w:rFonts w:ascii="Times New Roman" w:hAnsi="Times New Roman" w:cs="Times New Roman"/>
-          <w:sz w:val="30"/>
-          <w:szCs w:val="30"/>
-          <w:lang w:val="ru-BY"/>
-        </w:rPr>
-        <w:t>финасирования</w:t>
-      </w:r>
-      <w:proofErr w:type="spellEnd"/>
-      <w:r>
-        <w:rPr>
-          <w:rFonts w:ascii="Times New Roman" w:hAnsi="Times New Roman" w:cs="Times New Roman"/>
-          <w:sz w:val="30"/>
-          <w:szCs w:val="30"/>
-          <w:lang w:val="ru-BY"/>
-        </w:rPr>
-        <w:t xml:space="preserve"> организации в</w:t>
+        <w:t>Хранение истории коректирвок перераспределения между статьями, увеличение или уменьшение финасирования организации в</w:t>
       </w:r>
       <w:r>
         <w:rPr>
@@ -550,7 +496,6 @@
         </w:rPr>
         <w:t>3. Ведение плана государственных закупок, как публикуемой части (</w:t>
       </w:r>
-      <w:proofErr w:type="spellStart"/>
       <w:r>
         <w:rPr>
           <w:rFonts w:ascii="Times New Roman" w:hAnsi="Times New Roman" w:cs="Times New Roman"/>
@@ -560,7 +505,6 @@
         </w:rPr>
         <w:t>goszakupki</w:t>
       </w:r>
-      <w:proofErr w:type="spellEnd"/>
       <w:r>
         <w:rPr>
           <w:rFonts w:ascii="Times New Roman" w:hAnsi="Times New Roman" w:cs="Times New Roman"/>
@@ -676,7 +620,6 @@
         </w:rPr>
         <w:t xml:space="preserve">Автоматизация работы с сайтом </w:t>
       </w:r>
-      <w:proofErr w:type="spellStart"/>
       <w:r>
         <w:rPr>
           <w:rFonts w:ascii="Times New Roman" w:hAnsi="Times New Roman" w:cs="Times New Roman"/>
@@ -686,7 +629,6 @@
         </w:rPr>
         <w:t>goszakupki</w:t>
       </w:r>
-      <w:proofErr w:type="spellEnd"/>
       <w:r>
         <w:rPr>
           <w:rFonts w:ascii="Times New Roman" w:hAnsi="Times New Roman" w:cs="Times New Roman"/>
@@ -822,6 +764,131 @@
           <w:lang w:val="ru-BY"/>
         </w:rPr>
       </w:pPr>
+      <w:r>
+        <w:rPr>
+          <w:rFonts w:ascii="Times New Roman" w:hAnsi="Times New Roman" w:cs="Times New Roman"/>
+          <w:sz w:val="30"/>
+          <w:szCs w:val="30"/>
+          <w:lang w:val="ru-BY"/>
+        </w:rPr>
+        <w:lastRenderedPageBreak/>
+        <w:t xml:space="preserve">В моделе </w:t>
+      </w:r>
+      <w:r>
+        <w:rPr>
+          <w:rFonts w:ascii="Times New Roman" w:hAnsi="Times New Roman" w:cs="Times New Roman"/>
+          <w:sz w:val="30"/>
+          <w:szCs w:val="30"/>
+          <w:lang w:val="en-US"/>
+        </w:rPr>
+        <w:t>PlanVersion</w:t>
+      </w:r>
+      <w:r>
+        <w:rPr>
+          <w:rFonts w:ascii="Times New Roman" w:hAnsi="Times New Roman" w:cs="Times New Roman"/>
+          <w:sz w:val="30"/>
+          <w:szCs w:val="30"/>
+          <w:lang w:val="en-US"/>
+        </w:rPr>
+        <w:t xml:space="preserve"> </w:t>
+      </w:r>
+      <w:r>
+        <w:rPr>
+          <w:rFonts w:ascii="Times New Roman" w:hAnsi="Times New Roman" w:cs="Times New Roman"/>
+          <w:sz w:val="30"/>
+          <w:szCs w:val="30"/>
+          <w:lang w:val="ru-BY"/>
+        </w:rPr>
+        <w:t xml:space="preserve">исключаем поле </w:t>
+      </w:r>
+      <w:r>
+        <w:rPr>
+          <w:rFonts w:ascii="Times New Roman" w:hAnsi="Times New Roman" w:cs="Times New Roman"/>
+          <w:sz w:val="30"/>
+          <w:szCs w:val="30"/>
+          <w:lang w:val="en-US"/>
+        </w:rPr>
+        <w:t>is</w:t>
+      </w:r>
+      <w:r>
+        <w:rPr>
+          <w:rFonts w:ascii="Times New Roman" w:hAnsi="Times New Roman" w:cs="Times New Roman"/>
+          <w:sz w:val="30"/>
+          <w:szCs w:val="30"/>
+          <w:lang w:val="en-US"/>
+        </w:rPr>
+        <w:t>_</w:t>
+      </w:r>
+      <w:r>
+        <w:rPr>
+          <w:rFonts w:ascii="Times New Roman" w:hAnsi="Times New Roman" w:cs="Times New Roman"/>
+          <w:sz w:val="30"/>
+          <w:szCs w:val="30"/>
+          <w:lang w:val="en-US"/>
+        </w:rPr>
+        <w:t xml:space="preserve">active, version_number. </w:t>
+      </w:r>
+      <w:r>
+        <w:rPr>
+          <w:rFonts w:ascii="Times New Roman" w:hAnsi="Times New Roman" w:cs="Times New Roman"/>
+          <w:sz w:val="30"/>
+          <w:szCs w:val="30"/>
+          <w:lang w:val="ru-BY"/>
+        </w:rPr>
+        <w:t xml:space="preserve">Добавляем поле </w:t>
+      </w:r>
+      <w:r>
+        <w:rPr>
+          <w:rFonts w:ascii="Times New Roman" w:hAnsi="Times New Roman" w:cs="Times New Roman"/>
+          <w:sz w:val="30"/>
+          <w:szCs w:val="30"/>
+          <w:lang w:val="en-US"/>
+        </w:rPr>
+        <w:t>status</w:t>
+      </w:r>
+      <w:r>
+        <w:rPr>
+          <w:rFonts w:ascii="Times New Roman" w:hAnsi="Times New Roman" w:cs="Times New Roman"/>
+          <w:sz w:val="30"/>
+          <w:szCs w:val="30"/>
+        </w:rPr>
+        <w:t xml:space="preserve">. </w:t>
+      </w:r>
+      <w:r>
+        <w:rPr>
+          <w:rFonts w:ascii="Times New Roman" w:hAnsi="Times New Roman" w:cs="Times New Roman"/>
+          <w:sz w:val="30"/>
+          <w:szCs w:val="30"/>
+          <w:lang w:val="ru-BY"/>
+        </w:rPr>
+        <w:t xml:space="preserve">Для создания черновика создаем копию со статусом </w:t>
+      </w:r>
+      <w:r>
+        <w:rPr>
+          <w:rFonts w:ascii="Times New Roman" w:hAnsi="Times New Roman" w:cs="Times New Roman"/>
+          <w:sz w:val="30"/>
+          <w:szCs w:val="30"/>
+          <w:lang w:val="en-US"/>
+        </w:rPr>
+        <w:t>DRAFT</w:t>
+      </w:r>
+      <w:r>
+        <w:rPr>
+          <w:rFonts w:ascii="Times New Roman" w:hAnsi="Times New Roman" w:cs="Times New Roman"/>
+          <w:sz w:val="30"/>
+          <w:szCs w:val="30"/>
+        </w:rPr>
+        <w:t xml:space="preserve">. </w:t>
+      </w:r>
+      <w:r>
+        <w:rPr>
+          <w:rFonts w:ascii="Times New Roman" w:hAnsi="Times New Roman" w:cs="Times New Roman"/>
+          <w:sz w:val="30"/>
+          <w:szCs w:val="30"/>
+          <w:lang w:val="ru-BY"/>
+        </w:rPr>
+        <w:t xml:space="preserve">В при опубликовании плана записи со статусом </w:t>
+      </w:r>
     </w:p>
     <w:p>
       <w:pPr>
@@ -842,16 +909,25 @@
           <w:szCs w:val="30"/>
           <w:lang w:val="ru-BY"/>
         </w:rPr>
-        <w:t>С помощью своего фронта я планирую создавать черновики плана закупок или проекты изменений в план закупок (добавление, удаление, редактирование позиций), которые в дальнейшем будут по API отправляться на goszakupki.by. После утверждения руководителем организации изменений в плана на бумаге, закупщик по кнопке может отправить подготовленные в моем фронте изменения в план на goszakupki.by, чтобы повторно их не вводить. После отправки на сайте goszakupki.by образуется проект с изменениями, закупщик подписывает на сайте изменения в план с помощью ЭЦП. После опубликования нажав кнопку на моем фронте получаем актуальные позиции плана закупок</w:t>
-      </w:r>
-      <w:r>
-        <w:rPr>
-          <w:rFonts w:ascii="Times New Roman" w:hAnsi="Times New Roman" w:cs="Times New Roman"/>
-          <w:sz w:val="30"/>
-          <w:szCs w:val="30"/>
-          <w:lang w:val="ru-BY"/>
-        </w:rPr>
-        <w:t>.</w:t>
+        <w:t xml:space="preserve">+ </w:t>
+      </w:r>
+      <w:r>
+        <w:rPr>
+          <w:rFonts w:ascii="Times New Roman" w:hAnsi="Times New Roman" w:cs="Times New Roman"/>
+          <w:sz w:val="30"/>
+          <w:szCs w:val="30"/>
+          <w:lang w:val="en-US"/>
+        </w:rPr>
+        <w:t>status</w:t>
+      </w:r>
+      <w:r>
+        <w:rPr>
+          <w:rFonts w:ascii="Times New Roman" w:hAnsi="Times New Roman" w:cs="Times New Roman"/>
+          <w:sz w:val="30"/>
+          <w:szCs w:val="30"/>
+          <w:lang w:val="en-US"/>
+        </w:rPr>
+        <w:t xml:space="preserve"> d budget_cost.</w:t>
       </w:r>
     </w:p>
     <w:p>
@@ -870,7 +946,7 @@
     <w:p>
       <w:pPr>
         <w:spacing w:after="0" w:line="240" w:lineRule="auto"/>
-        <w:ind w:firstLine="709"/>
+        <w:ind w:firstLine="720"/>
         <w:jc w:val="both"/>
         <w:rPr>
           <w:rFonts w:ascii="Times New Roman" w:hAnsi="Times New Roman" w:cs="Times New Roman"/>
@@ -879,402 +955,27 @@
           <w:lang w:val="ru-BY"/>
         </w:rPr>
       </w:pPr>
-      <w:r>
-        <w:rPr>
-          <w:rFonts w:ascii="Times New Roman" w:hAnsi="Times New Roman" w:cs="Times New Roman"/>
-          <w:sz w:val="30"/>
-          <w:szCs w:val="30"/>
-          <w:lang w:val="ru-BY"/>
-        </w:rPr>
-        <w:t>1. </w:t>
-      </w:r>
-      <w:r>
-        <w:rPr>
-          <w:rFonts w:ascii="Times New Roman" w:hAnsi="Times New Roman" w:cs="Times New Roman"/>
-          <w:sz w:val="30"/>
-          <w:szCs w:val="30"/>
-          <w:lang w:val="ru-BY"/>
-        </w:rPr>
-        <w:t>Мы храним все КОРНЕВЫЕ пункты плана (</w:t>
-      </w:r>
-      <w:r>
-        <w:rPr>
-          <w:rFonts w:ascii="Times New Roman" w:hAnsi="Times New Roman" w:cs="Times New Roman"/>
-          <w:sz w:val="30"/>
-          <w:szCs w:val="30"/>
-          <w:lang w:val="ru-BY"/>
-        </w:rPr>
-        <w:t>публикуемые и непубликуемые</w:t>
-      </w:r>
-      <w:r>
-        <w:rPr>
-          <w:rFonts w:ascii="Times New Roman" w:hAnsi="Times New Roman" w:cs="Times New Roman"/>
-          <w:sz w:val="30"/>
-          <w:szCs w:val="30"/>
-          <w:lang w:val="ru-BY"/>
-        </w:rPr>
-        <w:t>)</w:t>
-      </w:r>
-      <w:r>
-        <w:rPr>
-          <w:rFonts w:ascii="Times New Roman" w:hAnsi="Times New Roman" w:cs="Times New Roman"/>
-          <w:sz w:val="30"/>
-          <w:szCs w:val="30"/>
-          <w:lang w:val="ru-BY"/>
-        </w:rPr>
-        <w:t xml:space="preserve"> (по статусу: </w:t>
-      </w:r>
-      <w:r>
-        <w:rPr>
-          <w:rFonts w:ascii="Times New Roman" w:hAnsi="Times New Roman" w:cs="Times New Roman"/>
-          <w:sz w:val="30"/>
-          <w:szCs w:val="30"/>
-          <w:lang w:val="ru-BY"/>
-        </w:rPr>
-        <w:t xml:space="preserve">    DRAFT = 'Черновик (Редактирование)'</w:t>
-      </w:r>
-      <w:r>
-        <w:rPr>
-          <w:rFonts w:ascii="Times New Roman" w:hAnsi="Times New Roman" w:cs="Times New Roman"/>
-          <w:sz w:val="30"/>
-          <w:szCs w:val="30"/>
-          <w:lang w:val="ru-BY"/>
-        </w:rPr>
-        <w:t>,</w:t>
-      </w:r>
-      <w:r>
-        <w:rPr>
-          <w:rFonts w:ascii="Times New Roman" w:hAnsi="Times New Roman" w:cs="Times New Roman"/>
-          <w:sz w:val="30"/>
-          <w:szCs w:val="30"/>
-          <w:lang w:val="ru-BY"/>
-        </w:rPr>
-        <w:t xml:space="preserve">    ON_REVIEW </w:t>
-      </w:r>
-      <w:r>
-        <w:rPr>
-          <w:rFonts w:ascii="Times New Roman" w:hAnsi="Times New Roman" w:cs="Times New Roman"/>
-          <w:sz w:val="30"/>
-          <w:szCs w:val="30"/>
-          <w:lang w:val="ru-BY"/>
-        </w:rPr>
-        <w:t xml:space="preserve">= </w:t>
-      </w:r>
-      <w:r>
-        <w:rPr>
-          <w:rFonts w:ascii="Times New Roman" w:hAnsi="Times New Roman" w:cs="Times New Roman"/>
-          <w:sz w:val="30"/>
-          <w:szCs w:val="30"/>
-          <w:lang w:val="ru-BY"/>
-        </w:rPr>
-        <w:t>'На проверке у финансиста'</w:t>
-      </w:r>
-      <w:r>
-        <w:rPr>
-          <w:rFonts w:ascii="Times New Roman" w:hAnsi="Times New Roman" w:cs="Times New Roman"/>
-          <w:sz w:val="30"/>
-          <w:szCs w:val="30"/>
-          <w:lang w:val="ru-BY"/>
-        </w:rPr>
-        <w:t xml:space="preserve">, </w:t>
-      </w:r>
-      <w:r>
-        <w:rPr>
-          <w:rFonts w:ascii="Times New Roman" w:hAnsi="Times New Roman" w:cs="Times New Roman"/>
-          <w:sz w:val="30"/>
-          <w:szCs w:val="30"/>
-          <w:lang w:val="ru-BY"/>
-        </w:rPr>
-        <w:t xml:space="preserve">  ACTIVE </w:t>
-      </w:r>
-      <w:r>
-        <w:rPr>
-          <w:rFonts w:ascii="Times New Roman" w:hAnsi="Times New Roman" w:cs="Times New Roman"/>
-          <w:sz w:val="30"/>
-          <w:szCs w:val="30"/>
-          <w:lang w:val="ru-BY"/>
-        </w:rPr>
-        <w:t xml:space="preserve">= </w:t>
-      </w:r>
-      <w:r>
-        <w:rPr>
-          <w:rFonts w:ascii="Times New Roman" w:hAnsi="Times New Roman" w:cs="Times New Roman"/>
-          <w:sz w:val="30"/>
-          <w:szCs w:val="30"/>
-          <w:lang w:val="ru-BY"/>
-        </w:rPr>
-        <w:t>'Утвержден (Доступен для договоров)'</w:t>
-      </w:r>
-      <w:r>
-        <w:rPr>
-          <w:rFonts w:ascii="Times New Roman" w:hAnsi="Times New Roman" w:cs="Times New Roman"/>
-          <w:sz w:val="30"/>
-          <w:szCs w:val="30"/>
-          <w:lang w:val="ru-BY"/>
-        </w:rPr>
-        <w:t xml:space="preserve">, </w:t>
-      </w:r>
-      <w:r>
-        <w:rPr>
-          <w:rFonts w:ascii="Times New Roman" w:hAnsi="Times New Roman" w:cs="Times New Roman"/>
-          <w:sz w:val="30"/>
-          <w:szCs w:val="30"/>
-          <w:lang w:val="ru-BY"/>
-        </w:rPr>
-        <w:t>PUBLISHED = 'Опубликован на goszakupki.by'</w:t>
-      </w:r>
-      <w:r>
-        <w:rPr>
-          <w:rFonts w:ascii="Times New Roman" w:hAnsi="Times New Roman" w:cs="Times New Roman"/>
-          <w:sz w:val="30"/>
-          <w:szCs w:val="30"/>
-          <w:lang w:val="ru-BY"/>
-        </w:rPr>
-        <w:t xml:space="preserve">, </w:t>
-      </w:r>
-      <w:r>
-        <w:rPr>
-          <w:rFonts w:ascii="Times New Roman" w:hAnsi="Times New Roman" w:cs="Times New Roman"/>
-          <w:sz w:val="30"/>
-          <w:szCs w:val="30"/>
-          <w:lang w:val="ru-BY"/>
-        </w:rPr>
-        <w:t>REJECTED = 'Отклонен финансистом'</w:t>
-      </w:r>
-      <w:r>
-        <w:rPr>
-          <w:rFonts w:ascii="Times New Roman" w:hAnsi="Times New Roman" w:cs="Times New Roman"/>
-          <w:sz w:val="30"/>
-          <w:szCs w:val="30"/>
-          <w:lang w:val="ru-BY"/>
-        </w:rPr>
-        <w:t xml:space="preserve">, </w:t>
-      </w:r>
-      <w:r>
-        <w:rPr>
-          <w:rFonts w:ascii="Times New Roman" w:hAnsi="Times New Roman" w:cs="Times New Roman"/>
-          <w:sz w:val="30"/>
-          <w:szCs w:val="30"/>
-          <w:lang w:val="ru-BY"/>
-        </w:rPr>
-        <w:t xml:space="preserve">DELETED </w:t>
-      </w:r>
-      <w:r>
-        <w:rPr>
-          <w:rFonts w:ascii="Times New Roman" w:hAnsi="Times New Roman" w:cs="Times New Roman"/>
-          <w:sz w:val="30"/>
-          <w:szCs w:val="30"/>
-          <w:lang w:val="ru-BY"/>
-        </w:rPr>
-        <w:t xml:space="preserve">= </w:t>
-      </w:r>
-      <w:r>
-        <w:rPr>
-          <w:rFonts w:ascii="Times New Roman" w:hAnsi="Times New Roman" w:cs="Times New Roman"/>
-          <w:sz w:val="30"/>
-          <w:szCs w:val="30"/>
-          <w:lang w:val="ru-BY"/>
-        </w:rPr>
-        <w:t>'Исключен'</w:t>
-      </w:r>
-      <w:r>
-        <w:rPr>
-          <w:rFonts w:ascii="Times New Roman" w:hAnsi="Times New Roman" w:cs="Times New Roman"/>
-          <w:sz w:val="30"/>
-          <w:szCs w:val="30"/>
-          <w:lang w:val="ru-BY"/>
-        </w:rPr>
-        <w:t>)</w:t>
-      </w:r>
-      <w:r>
-        <w:rPr>
-          <w:rFonts w:ascii="Times New Roman" w:hAnsi="Times New Roman" w:cs="Times New Roman"/>
-          <w:sz w:val="30"/>
-          <w:szCs w:val="30"/>
-          <w:lang w:val="ru-BY"/>
-        </w:rPr>
-        <w:t xml:space="preserve">. Минимальная информация: </w:t>
-      </w:r>
-      <w:proofErr w:type="spellStart"/>
-      <w:r>
-        <w:rPr>
-          <w:rFonts w:ascii="Times New Roman" w:hAnsi="Times New Roman" w:cs="Times New Roman"/>
-          <w:sz w:val="30"/>
-          <w:szCs w:val="30"/>
-          <w:lang w:val="ru-BY"/>
-        </w:rPr>
-        <w:t>num</w:t>
-      </w:r>
-      <w:proofErr w:type="spellEnd"/>
-      <w:r>
-        <w:rPr>
-          <w:rFonts w:ascii="Times New Roman" w:hAnsi="Times New Roman" w:cs="Times New Roman"/>
-          <w:sz w:val="30"/>
-          <w:szCs w:val="30"/>
-          <w:lang w:val="ru-BY"/>
-        </w:rPr>
-        <w:t xml:space="preserve">, </w:t>
-      </w:r>
-      <w:proofErr w:type="spellStart"/>
-      <w:r>
-        <w:rPr>
-          <w:rFonts w:ascii="Times New Roman" w:hAnsi="Times New Roman" w:cs="Times New Roman"/>
-          <w:sz w:val="30"/>
-          <w:szCs w:val="30"/>
-          <w:lang w:val="ru-BY"/>
-        </w:rPr>
-        <w:t>is_public</w:t>
-      </w:r>
-      <w:proofErr w:type="spellEnd"/>
-      <w:r>
-        <w:rPr>
-          <w:rFonts w:ascii="Times New Roman" w:hAnsi="Times New Roman" w:cs="Times New Roman"/>
-          <w:sz w:val="30"/>
-          <w:szCs w:val="30"/>
-          <w:lang w:val="ru-BY"/>
-        </w:rPr>
-        <w:t xml:space="preserve">, </w:t>
-      </w:r>
-      <w:proofErr w:type="spellStart"/>
-      <w:r>
-        <w:rPr>
-          <w:rFonts w:ascii="Times New Roman" w:hAnsi="Times New Roman" w:cs="Times New Roman"/>
-          <w:sz w:val="30"/>
-          <w:szCs w:val="30"/>
-          <w:lang w:val="ru-BY"/>
-        </w:rPr>
-        <w:t>status</w:t>
-      </w:r>
-      <w:proofErr w:type="spellEnd"/>
-      <w:r>
-        <w:rPr>
-          <w:rFonts w:ascii="Times New Roman" w:hAnsi="Times New Roman" w:cs="Times New Roman"/>
-          <w:sz w:val="30"/>
-          <w:szCs w:val="30"/>
-          <w:lang w:val="ru-BY"/>
-        </w:rPr>
-        <w:t xml:space="preserve">, </w:t>
-      </w:r>
-      <w:proofErr w:type="spellStart"/>
-      <w:r>
-        <w:rPr>
-          <w:rFonts w:ascii="Times New Roman" w:hAnsi="Times New Roman" w:cs="Times New Roman"/>
-          <w:sz w:val="30"/>
-          <w:szCs w:val="30"/>
-          <w:lang w:val="ru-BY"/>
-        </w:rPr>
-        <w:t>created_at</w:t>
-      </w:r>
-      <w:proofErr w:type="spellEnd"/>
-      <w:r>
-        <w:rPr>
-          <w:rFonts w:ascii="Times New Roman" w:hAnsi="Times New Roman" w:cs="Times New Roman"/>
-          <w:sz w:val="30"/>
-          <w:szCs w:val="30"/>
-          <w:lang w:val="ru-BY"/>
-        </w:rPr>
-        <w:t xml:space="preserve">, </w:t>
-      </w:r>
-      <w:proofErr w:type="spellStart"/>
-      <w:r>
-        <w:rPr>
-          <w:rFonts w:ascii="Times New Roman" w:hAnsi="Times New Roman" w:cs="Times New Roman"/>
-          <w:sz w:val="30"/>
-          <w:szCs w:val="30"/>
-          <w:lang w:val="ru-BY"/>
-        </w:rPr>
-        <w:t>updated_at</w:t>
-      </w:r>
-      <w:proofErr w:type="spellEnd"/>
-      <w:r>
-        <w:rPr>
-          <w:rFonts w:ascii="Times New Roman" w:hAnsi="Times New Roman" w:cs="Times New Roman"/>
-          <w:sz w:val="30"/>
-          <w:szCs w:val="30"/>
-          <w:lang w:val="ru-BY"/>
-        </w:rPr>
-        <w:t xml:space="preserve">. Если я хочу внести изменения в КОРНЕВОЙ пункт или исключить </w:t>
-      </w:r>
-      <w:r>
-        <w:rPr>
-          <w:rFonts w:ascii="Times New Roman" w:hAnsi="Times New Roman" w:cs="Times New Roman"/>
-          <w:sz w:val="30"/>
-          <w:szCs w:val="30"/>
-          <w:lang w:val="ru-BY"/>
-        </w:rPr>
-        <w:t>его из плана у меня должны быть доступны две кнопки: изменить и исключить. При нажатии на исключить</w:t>
-      </w:r>
-      <w:r>
-        <w:rPr>
-          <w:rFonts w:ascii="Times New Roman" w:hAnsi="Times New Roman" w:cs="Times New Roman"/>
-          <w:sz w:val="30"/>
-          <w:szCs w:val="30"/>
-          <w:lang w:val="ru-BY"/>
-        </w:rPr>
-        <w:t xml:space="preserve"> и изменить</w:t>
-      </w:r>
-      <w:r>
-        <w:rPr>
-          <w:rFonts w:ascii="Times New Roman" w:hAnsi="Times New Roman" w:cs="Times New Roman"/>
-          <w:sz w:val="30"/>
-          <w:szCs w:val="30"/>
-          <w:lang w:val="ru-BY"/>
-        </w:rPr>
-        <w:t xml:space="preserve"> должен создаваться </w:t>
-      </w:r>
-      <w:r>
-        <w:rPr>
-          <w:rFonts w:ascii="Times New Roman" w:hAnsi="Times New Roman" w:cs="Times New Roman"/>
-          <w:sz w:val="30"/>
-          <w:szCs w:val="30"/>
-          <w:lang w:val="ru-BY"/>
-        </w:rPr>
-        <w:t>или проект с предлагаемыми изменениями или полная копия плана в редакции, учитывающей планируемы изменения. Это нужно, что</w:t>
-      </w:r>
-      <w:r>
-        <w:rPr>
-          <w:rFonts w:ascii="Times New Roman" w:hAnsi="Times New Roman" w:cs="Times New Roman"/>
-          <w:sz w:val="30"/>
-          <w:szCs w:val="30"/>
-          <w:lang w:val="ru-BY"/>
-        </w:rPr>
-        <w:t>бы</w:t>
-      </w:r>
-      <w:r>
-        <w:rPr>
-          <w:rFonts w:ascii="Times New Roman" w:hAnsi="Times New Roman" w:cs="Times New Roman"/>
-          <w:sz w:val="30"/>
-          <w:szCs w:val="30"/>
-          <w:lang w:val="ru-BY"/>
-        </w:rPr>
-        <w:t xml:space="preserve"> пользователь-финансист видел, как измен</w:t>
-      </w:r>
-      <w:r>
-        <w:rPr>
-          <w:rFonts w:ascii="Times New Roman" w:hAnsi="Times New Roman" w:cs="Times New Roman"/>
-          <w:sz w:val="30"/>
-          <w:szCs w:val="30"/>
-          <w:lang w:val="ru-BY"/>
-        </w:rPr>
-        <w:t>и</w:t>
-      </w:r>
-      <w:r>
-        <w:rPr>
-          <w:rFonts w:ascii="Times New Roman" w:hAnsi="Times New Roman" w:cs="Times New Roman"/>
-          <w:sz w:val="30"/>
-          <w:szCs w:val="30"/>
-          <w:lang w:val="ru-BY"/>
-        </w:rPr>
-        <w:t xml:space="preserve">тся </w:t>
-      </w:r>
-      <w:r>
-        <w:rPr>
-          <w:rFonts w:ascii="Times New Roman" w:hAnsi="Times New Roman" w:cs="Times New Roman"/>
-          <w:sz w:val="30"/>
-          <w:szCs w:val="30"/>
-          <w:lang w:val="ru-BY"/>
-        </w:rPr>
-        <w:t>распределение денежных средств по статьям расходов и между подразделениями, в случае опубликования проекта плана, и не превышены ли лимиты денежных средств в целом и разрезе статей</w:t>
+    </w:p>
+    <w:p>
+      <w:pPr>
+        <w:spacing w:after="0" w:line="240" w:lineRule="auto"/>
+        <w:ind w:firstLine="720"/>
+        <w:jc w:val="both"/>
+        <w:rPr>
+          <w:rFonts w:ascii="Times New Roman" w:hAnsi="Times New Roman" w:cs="Times New Roman"/>
+          <w:sz w:val="30"/>
+          <w:szCs w:val="30"/>
+          <w:lang w:val="ru-BY"/>
+        </w:rPr>
+      </w:pPr>
+      <w:r>
+        <w:rPr>
+          <w:rFonts w:ascii="Times New Roman" w:hAnsi="Times New Roman" w:cs="Times New Roman"/>
+          <w:sz w:val="30"/>
+          <w:szCs w:val="30"/>
+          <w:lang w:val="ru-BY"/>
+        </w:rPr>
+        <w:t>С помощью своего фронта я планирую создавать черновики плана закупок или проекты изменений в план закупок (добавление, удаление, редактирование позиций), которые в дальнейшем будут по API отправляться на goszakupki.by. После утверждения руководителем организации изменений в плана на бумаге, закупщик по кнопке может отправить подготовленные в моем фронте изменения в план на goszakupki.by, чтобы повторно их не вводить. После отправки на сайте goszakupki.by образуется проект с изменениями, закупщик подписывает на сайте изменения в план с помощью ЭЦП. После опубликования нажав кнопку на моем фронте получаем актуальные позиции плана закупок</w:t>
       </w:r>
       <w:r>
         <w:rPr>
@@ -1285,6 +986,19 @@
         </w:rPr>
         <w:t>.</w:t>
       </w:r>
+    </w:p>
+    <w:p>
+      <w:pPr>
+        <w:spacing w:after="0" w:line="240" w:lineRule="auto"/>
+        <w:ind w:firstLine="720"/>
+        <w:jc w:val="both"/>
+        <w:rPr>
+          <w:rFonts w:ascii="Times New Roman" w:hAnsi="Times New Roman" w:cs="Times New Roman"/>
+          <w:sz w:val="30"/>
+          <w:szCs w:val="30"/>
+          <w:lang w:val="ru-BY"/>
+        </w:rPr>
+      </w:pPr>
     </w:p>
     <w:p>
       <w:pPr>
@@ -1305,6 +1019,208 @@
           <w:szCs w:val="30"/>
           <w:lang w:val="ru-BY"/>
         </w:rPr>
+        <w:t>1. </w:t>
+      </w:r>
+      <w:r>
+        <w:rPr>
+          <w:rFonts w:ascii="Times New Roman" w:hAnsi="Times New Roman" w:cs="Times New Roman"/>
+          <w:sz w:val="30"/>
+          <w:szCs w:val="30"/>
+          <w:lang w:val="ru-BY"/>
+        </w:rPr>
+        <w:t>Мы храним все КОРНЕВЫЕ пункты плана (</w:t>
+      </w:r>
+      <w:r>
+        <w:rPr>
+          <w:rFonts w:ascii="Times New Roman" w:hAnsi="Times New Roman" w:cs="Times New Roman"/>
+          <w:sz w:val="30"/>
+          <w:szCs w:val="30"/>
+          <w:lang w:val="ru-BY"/>
+        </w:rPr>
+        <w:t>публикуемые и непубликуемые</w:t>
+      </w:r>
+      <w:r>
+        <w:rPr>
+          <w:rFonts w:ascii="Times New Roman" w:hAnsi="Times New Roman" w:cs="Times New Roman"/>
+          <w:sz w:val="30"/>
+          <w:szCs w:val="30"/>
+          <w:lang w:val="ru-BY"/>
+        </w:rPr>
+        <w:t>)</w:t>
+      </w:r>
+      <w:r>
+        <w:rPr>
+          <w:rFonts w:ascii="Times New Roman" w:hAnsi="Times New Roman" w:cs="Times New Roman"/>
+          <w:sz w:val="30"/>
+          <w:szCs w:val="30"/>
+          <w:lang w:val="ru-BY"/>
+        </w:rPr>
+        <w:t xml:space="preserve"> (по статусу:     DRAFT = 'Черновик (Редактирование)',    ON_REVIEW = 'На проверке у финансиста',   ACTIVE = 'Утвержден (Доступен для договоров)', PUBLISHED = 'Опубликован на goszakupki.by', REJECTED = 'Отклонен финансистом'</w:t>
+      </w:r>
+      <w:r>
+        <w:rPr>
+          <w:rFonts w:ascii="Times New Roman" w:hAnsi="Times New Roman" w:cs="Times New Roman"/>
+          <w:sz w:val="30"/>
+          <w:szCs w:val="30"/>
+          <w:lang w:val="ru-BY"/>
+        </w:rPr>
+        <w:t xml:space="preserve">, </w:t>
+      </w:r>
+      <w:r>
+        <w:rPr>
+          <w:rFonts w:ascii="Times New Roman" w:hAnsi="Times New Roman" w:cs="Times New Roman"/>
+          <w:sz w:val="30"/>
+          <w:szCs w:val="30"/>
+          <w:lang w:val="ru-BY"/>
+        </w:rPr>
+        <w:t xml:space="preserve">DELETED </w:t>
+      </w:r>
+      <w:r>
+        <w:rPr>
+          <w:rFonts w:ascii="Times New Roman" w:hAnsi="Times New Roman" w:cs="Times New Roman"/>
+          <w:sz w:val="30"/>
+          <w:szCs w:val="30"/>
+          <w:lang w:val="ru-BY"/>
+        </w:rPr>
+        <w:t xml:space="preserve">= </w:t>
+      </w:r>
+      <w:r>
+        <w:rPr>
+          <w:rFonts w:ascii="Times New Roman" w:hAnsi="Times New Roman" w:cs="Times New Roman"/>
+          <w:sz w:val="30"/>
+          <w:szCs w:val="30"/>
+          <w:lang w:val="ru-BY"/>
+        </w:rPr>
+        <w:t>'Исключен')</w:t>
+      </w:r>
+      <w:r>
+        <w:rPr>
+          <w:rFonts w:ascii="Times New Roman" w:hAnsi="Times New Roman" w:cs="Times New Roman"/>
+          <w:sz w:val="30"/>
+          <w:szCs w:val="30"/>
+          <w:lang w:val="ru-BY"/>
+        </w:rPr>
+        <w:t>. Минимальная информация: num, is_public, status, created_at, updated_at</w:t>
+      </w:r>
+      <w:r>
+        <w:rPr>
+          <w:rFonts w:ascii="Times New Roman" w:hAnsi="Times New Roman" w:cs="Times New Roman"/>
+          <w:sz w:val="30"/>
+          <w:szCs w:val="30"/>
+          <w:lang w:val="ru-BY"/>
+        </w:rPr>
+        <w:t xml:space="preserve">. Если я хочу внести изменения в КОРНЕВОЙ пункт или исключить </w:t>
+      </w:r>
+      <w:r>
+        <w:rPr>
+          <w:rFonts w:ascii="Times New Roman" w:hAnsi="Times New Roman" w:cs="Times New Roman"/>
+          <w:sz w:val="30"/>
+          <w:szCs w:val="30"/>
+          <w:lang w:val="ru-BY"/>
+        </w:rPr>
+        <w:t>его из плана у меня должны быть доступны две кнопки: изменить и исключить. При нажатии на исключить</w:t>
+      </w:r>
+      <w:r>
+        <w:rPr>
+          <w:rFonts w:ascii="Times New Roman" w:hAnsi="Times New Roman" w:cs="Times New Roman"/>
+          <w:sz w:val="30"/>
+          <w:szCs w:val="30"/>
+          <w:lang w:val="ru-BY"/>
+        </w:rPr>
+        <w:t xml:space="preserve"> и изменить</w:t>
+      </w:r>
+      <w:r>
+        <w:rPr>
+          <w:rFonts w:ascii="Times New Roman" w:hAnsi="Times New Roman" w:cs="Times New Roman"/>
+          <w:sz w:val="30"/>
+          <w:szCs w:val="30"/>
+          <w:lang w:val="ru-BY"/>
+        </w:rPr>
+        <w:t xml:space="preserve"> должен создаваться </w:t>
+      </w:r>
+      <w:r>
+        <w:rPr>
+          <w:rFonts w:ascii="Times New Roman" w:hAnsi="Times New Roman" w:cs="Times New Roman"/>
+          <w:sz w:val="30"/>
+          <w:szCs w:val="30"/>
+          <w:lang w:val="ru-BY"/>
+        </w:rPr>
+        <w:t>или проект с предлагаемыми изменениями или полная копия плана в редакции, учитывающей планируемы изменения. Это нужно, что</w:t>
+      </w:r>
+      <w:r>
+        <w:rPr>
+          <w:rFonts w:ascii="Times New Roman" w:hAnsi="Times New Roman" w:cs="Times New Roman"/>
+          <w:sz w:val="30"/>
+          <w:szCs w:val="30"/>
+          <w:lang w:val="ru-BY"/>
+        </w:rPr>
+        <w:t>бы</w:t>
+      </w:r>
+      <w:r>
+        <w:rPr>
+          <w:rFonts w:ascii="Times New Roman" w:hAnsi="Times New Roman" w:cs="Times New Roman"/>
+          <w:sz w:val="30"/>
+          <w:szCs w:val="30"/>
+          <w:lang w:val="ru-BY"/>
+        </w:rPr>
+        <w:t xml:space="preserve"> пользователь-финансист видел, как измен</w:t>
+      </w:r>
+      <w:r>
+        <w:rPr>
+          <w:rFonts w:ascii="Times New Roman" w:hAnsi="Times New Roman" w:cs="Times New Roman"/>
+          <w:sz w:val="30"/>
+          <w:szCs w:val="30"/>
+          <w:lang w:val="ru-BY"/>
+        </w:rPr>
+        <w:t>и</w:t>
+      </w:r>
+      <w:r>
+        <w:rPr>
+          <w:rFonts w:ascii="Times New Roman" w:hAnsi="Times New Roman" w:cs="Times New Roman"/>
+          <w:sz w:val="30"/>
+          <w:szCs w:val="30"/>
+          <w:lang w:val="ru-BY"/>
+        </w:rPr>
+        <w:t xml:space="preserve">тся </w:t>
+      </w:r>
+      <w:r>
+        <w:rPr>
+          <w:rFonts w:ascii="Times New Roman" w:hAnsi="Times New Roman" w:cs="Times New Roman"/>
+          <w:sz w:val="30"/>
+          <w:szCs w:val="30"/>
+          <w:lang w:val="ru-BY"/>
+        </w:rPr>
+        <w:t>распределение денежных средств по статьям расходов и между подразделениями, в случае опубликования проекта плана, и не превышены ли лимиты денежных средств в целом и разрезе статей</w:t>
+      </w:r>
+      <w:r>
+        <w:rPr>
+          <w:rFonts w:ascii="Times New Roman" w:hAnsi="Times New Roman" w:cs="Times New Roman"/>
+          <w:sz w:val="30"/>
+          <w:szCs w:val="30"/>
+          <w:lang w:val="ru-BY"/>
+        </w:rPr>
+        <w:t>.</w:t>
+      </w:r>
+    </w:p>
+    <w:p>
+      <w:pPr>
+        <w:spacing w:after="0" w:line="240" w:lineRule="auto"/>
+        <w:ind w:firstLine="709"/>
+        <w:jc w:val="both"/>
+        <w:rPr>
+          <w:rFonts w:ascii="Times New Roman" w:hAnsi="Times New Roman" w:cs="Times New Roman"/>
+          <w:sz w:val="30"/>
+          <w:szCs w:val="30"/>
+          <w:lang w:val="ru-BY"/>
+        </w:rPr>
+      </w:pPr>
+      <w:r>
+        <w:rPr>
+          <w:rFonts w:ascii="Times New Roman" w:hAnsi="Times New Roman" w:cs="Times New Roman"/>
+          <w:sz w:val="30"/>
+          <w:szCs w:val="30"/>
+          <w:lang w:val="ru-BY"/>
+        </w:rPr>
         <w:t>2. </w:t>
       </w:r>
       <w:r>
@@ -1388,1066 +1304,590 @@
         </w:rPr>
         <w:t xml:space="preserve"> версии пункта плана: </w:t>
       </w:r>
-      <w:proofErr w:type="spellStart"/>
-      <w:r>
-        <w:rPr>
-          <w:rFonts w:ascii="Times New Roman" w:hAnsi="Times New Roman" w:cs="Times New Roman"/>
-          <w:sz w:val="30"/>
-          <w:szCs w:val="30"/>
-          <w:lang w:val="ru-BY"/>
-        </w:rPr>
-        <w:t>version_number</w:t>
-      </w:r>
-      <w:proofErr w:type="spellEnd"/>
-      <w:r>
-        <w:rPr>
-          <w:rFonts w:ascii="Times New Roman" w:hAnsi="Times New Roman" w:cs="Times New Roman"/>
-          <w:sz w:val="30"/>
-          <w:szCs w:val="30"/>
-          <w:lang w:val="ru-BY"/>
+      <w:r>
+        <w:rPr>
+          <w:rFonts w:ascii="Times New Roman" w:hAnsi="Times New Roman" w:cs="Times New Roman"/>
+          <w:sz w:val="30"/>
+          <w:szCs w:val="30"/>
+          <w:lang w:val="ru-BY"/>
+        </w:rPr>
+        <w:t>version_number, created_at, changed_at, changed_by, is_active, plan_goszakupki_id, purchases_id, unp_budget, title, okrb, okrb_title, okrb_product, type, val_amount, val_type, val_unit, fund_cost, inner_cost, val_currency, procedure_months, is_by_organizator</w:t>
+      </w:r>
+    </w:p>
+    <w:p>
+      <w:pPr>
+        <w:ind w:firstLine="720"/>
+        <w:rPr>
+          <w:rFonts w:ascii="Times New Roman" w:hAnsi="Times New Roman" w:cs="Times New Roman"/>
+          <w:sz w:val="30"/>
+          <w:szCs w:val="30"/>
+          <w:lang w:val="ru-BY"/>
+        </w:rPr>
+      </w:pPr>
+      <w:r>
+        <w:rPr>
+          <w:rFonts w:ascii="Times New Roman" w:hAnsi="Times New Roman" w:cs="Times New Roman"/>
+          <w:sz w:val="30"/>
+          <w:szCs w:val="30"/>
+          <w:lang w:val="ru-BY"/>
+        </w:rPr>
+        <w:t>3. </w:t>
+      </w:r>
+      <w:r>
+        <w:rPr>
+          <w:rFonts w:ascii="Times New Roman" w:hAnsi="Times New Roman" w:cs="Times New Roman"/>
+          <w:sz w:val="30"/>
+          <w:szCs w:val="30"/>
+          <w:lang w:val="ru-BY"/>
+        </w:rPr>
+        <w:t xml:space="preserve">При отображении (сериализации) отдаем </w:t>
+      </w:r>
+      <w:r>
+        <w:rPr>
+          <w:rFonts w:ascii="Times New Roman" w:hAnsi="Times New Roman" w:cs="Times New Roman"/>
+          <w:sz w:val="30"/>
+          <w:szCs w:val="30"/>
+          <w:lang w:val="ru-BY"/>
+        </w:rPr>
+        <w:t>КОРНЕВЫЕ пункты</w:t>
+      </w:r>
+      <w:r>
+        <w:rPr>
+          <w:rFonts w:ascii="Times New Roman" w:hAnsi="Times New Roman" w:cs="Times New Roman"/>
+          <w:sz w:val="30"/>
+          <w:szCs w:val="30"/>
+          <w:lang w:val="ru-BY"/>
+        </w:rPr>
+        <w:t xml:space="preserve"> (</w:t>
+      </w:r>
+      <w:r>
+        <w:rPr>
+          <w:rFonts w:ascii="Times New Roman" w:hAnsi="Times New Roman" w:cs="Times New Roman"/>
+          <w:sz w:val="30"/>
+          <w:szCs w:val="30"/>
+          <w:lang w:val="ru-BY"/>
+        </w:rPr>
+        <w:t>ACTIVE</w:t>
+      </w:r>
+      <w:r>
+        <w:rPr>
+          <w:lang w:val="ru-BY"/>
+        </w:rPr>
+        <w:t xml:space="preserve"> </w:t>
+      </w:r>
+      <w:r>
+        <w:rPr>
+          <w:lang w:val="ru-BY"/>
+        </w:rPr>
+        <w:t xml:space="preserve">и </w:t>
+      </w:r>
+      <w:r>
+        <w:rPr>
+          <w:rFonts w:ascii="Times New Roman" w:hAnsi="Times New Roman" w:cs="Times New Roman"/>
+          <w:sz w:val="30"/>
+          <w:szCs w:val="30"/>
+          <w:lang w:val="ru-BY"/>
+        </w:rPr>
+        <w:t>PUBLISHED</w:t>
+      </w:r>
+      <w:r>
+        <w:rPr>
+          <w:rFonts w:ascii="Times New Roman" w:hAnsi="Times New Roman" w:cs="Times New Roman"/>
+          <w:sz w:val="30"/>
+          <w:szCs w:val="30"/>
+          <w:lang w:val="ru-BY"/>
+        </w:rPr>
+        <w:t>)</w:t>
+      </w:r>
+      <w:r>
+        <w:rPr>
+          <w:rFonts w:ascii="Times New Roman" w:hAnsi="Times New Roman" w:cs="Times New Roman"/>
+          <w:sz w:val="30"/>
+          <w:szCs w:val="30"/>
+          <w:lang w:val="ru-BY"/>
+        </w:rPr>
+        <w:t xml:space="preserve"> и все</w:t>
+      </w:r>
+      <w:r>
+        <w:rPr>
+          <w:rFonts w:ascii="Times New Roman" w:hAnsi="Times New Roman" w:cs="Times New Roman"/>
+          <w:sz w:val="30"/>
+          <w:szCs w:val="30"/>
+          <w:lang w:val="ru-BY"/>
+        </w:rPr>
+        <w:t xml:space="preserve"> </w:t>
+      </w:r>
+      <w:r>
+        <w:rPr>
+          <w:rFonts w:ascii="Times New Roman" w:hAnsi="Times New Roman" w:cs="Times New Roman"/>
+          <w:sz w:val="30"/>
+          <w:szCs w:val="30"/>
+          <w:lang w:val="ru-BY"/>
+        </w:rPr>
+        <w:t>связанные с ними</w:t>
+      </w:r>
+      <w:r>
+        <w:rPr>
+          <w:rFonts w:ascii="Times New Roman" w:hAnsi="Times New Roman" w:cs="Times New Roman"/>
+          <w:sz w:val="30"/>
+          <w:szCs w:val="30"/>
+          <w:lang w:val="ru-BY"/>
+        </w:rPr>
+        <w:t xml:space="preserve"> </w:t>
+      </w:r>
+      <w:r>
+        <w:rPr>
+          <w:rFonts w:ascii="Times New Roman" w:hAnsi="Times New Roman" w:cs="Times New Roman"/>
+          <w:sz w:val="30"/>
+          <w:szCs w:val="30"/>
+          <w:lang w:val="ru-BY"/>
+        </w:rPr>
+        <w:t>ПОДРОБНЫЕ</w:t>
+      </w:r>
+      <w:r>
+        <w:rPr>
+          <w:rFonts w:ascii="Times New Roman" w:hAnsi="Times New Roman" w:cs="Times New Roman"/>
+          <w:sz w:val="30"/>
+          <w:szCs w:val="30"/>
+          <w:lang w:val="ru-BY"/>
+        </w:rPr>
+        <w:t xml:space="preserve"> </w:t>
+      </w:r>
+      <w:r>
+        <w:rPr>
+          <w:rFonts w:ascii="Times New Roman" w:hAnsi="Times New Roman" w:cs="Times New Roman"/>
+          <w:sz w:val="30"/>
+          <w:szCs w:val="30"/>
+          <w:lang w:val="ru-BY"/>
+        </w:rPr>
+        <w:t>версии</w:t>
+      </w:r>
+      <w:r>
+        <w:rPr>
+          <w:rFonts w:ascii="Times New Roman" w:hAnsi="Times New Roman" w:cs="Times New Roman"/>
+          <w:sz w:val="30"/>
+          <w:szCs w:val="30"/>
+          <w:lang w:val="ru-BY"/>
+        </w:rPr>
+        <w:t xml:space="preserve"> </w:t>
+      </w:r>
+      <w:r>
+        <w:rPr>
+          <w:rFonts w:ascii="Times New Roman" w:hAnsi="Times New Roman" w:cs="Times New Roman"/>
+          <w:sz w:val="30"/>
+          <w:szCs w:val="30"/>
+          <w:lang w:val="ru-BY"/>
+        </w:rPr>
+        <w:t>или только</w:t>
+      </w:r>
+      <w:r>
+        <w:rPr>
+          <w:rFonts w:ascii="Times New Roman" w:hAnsi="Times New Roman" w:cs="Times New Roman"/>
+          <w:sz w:val="30"/>
+          <w:szCs w:val="30"/>
+          <w:lang w:val="ru-BY"/>
+        </w:rPr>
+        <w:t xml:space="preserve"> </w:t>
+      </w:r>
+      <w:r>
+        <w:rPr>
+          <w:rFonts w:ascii="Times New Roman" w:hAnsi="Times New Roman" w:cs="Times New Roman"/>
+          <w:sz w:val="30"/>
+          <w:szCs w:val="30"/>
+          <w:lang w:val="ru-BY"/>
+        </w:rPr>
+        <w:t>последнюю</w:t>
+      </w:r>
+      <w:r>
+        <w:rPr>
+          <w:rFonts w:ascii="Times New Roman" w:hAnsi="Times New Roman" w:cs="Times New Roman"/>
+          <w:sz w:val="30"/>
+          <w:szCs w:val="30"/>
+          <w:lang w:val="ru-BY"/>
+        </w:rPr>
+        <w:t xml:space="preserve"> (</w:t>
+      </w:r>
+      <w:r>
+        <w:rPr>
+          <w:rFonts w:ascii="Times New Roman" w:hAnsi="Times New Roman" w:cs="Times New Roman"/>
+          <w:sz w:val="30"/>
+          <w:szCs w:val="30"/>
+          <w:lang w:val="ru-BY"/>
+        </w:rPr>
+        <w:t>а</w:t>
+      </w:r>
+      <w:r>
+        <w:rPr>
+          <w:rFonts w:ascii="Times New Roman" w:hAnsi="Times New Roman" w:cs="Times New Roman"/>
+          <w:sz w:val="30"/>
+          <w:szCs w:val="30"/>
+          <w:lang w:val="ru-BY"/>
+        </w:rPr>
+        <w:t>ктивную?</w:t>
+      </w:r>
+      <w:r>
+        <w:rPr>
+          <w:rFonts w:ascii="Times New Roman" w:hAnsi="Times New Roman" w:cs="Times New Roman"/>
+          <w:sz w:val="30"/>
+          <w:szCs w:val="30"/>
+          <w:lang w:val="ru-BY"/>
+        </w:rPr>
+        <w:t>)</w:t>
+      </w:r>
+    </w:p>
+    <w:p>
+      <w:pPr>
+        <w:ind w:firstLine="720"/>
+        <w:rPr>
+          <w:rFonts w:ascii="Times New Roman" w:hAnsi="Times New Roman" w:cs="Times New Roman"/>
+          <w:sz w:val="30"/>
+          <w:szCs w:val="30"/>
+          <w:lang w:val="en-US"/>
+        </w:rPr>
+      </w:pPr>
+      <w:r>
+        <w:rPr>
+          <w:rFonts w:ascii="Times New Roman" w:hAnsi="Times New Roman" w:cs="Times New Roman"/>
+          <w:sz w:val="30"/>
+          <w:szCs w:val="30"/>
+          <w:lang w:val="ru-BY"/>
+        </w:rPr>
+        <w:t>4. В каждой ПОДРОБНОЙ</w:t>
+      </w:r>
+      <w:r>
+        <w:rPr>
+          <w:rFonts w:ascii="Times New Roman" w:hAnsi="Times New Roman" w:cs="Times New Roman"/>
+          <w:sz w:val="30"/>
+          <w:szCs w:val="30"/>
+          <w:lang w:val="ru-BY"/>
+        </w:rPr>
+        <w:t xml:space="preserve"> </w:t>
+      </w:r>
+      <w:r>
+        <w:rPr>
+          <w:rFonts w:ascii="Times New Roman" w:hAnsi="Times New Roman" w:cs="Times New Roman"/>
+          <w:sz w:val="30"/>
+          <w:szCs w:val="30"/>
+          <w:lang w:val="ru-BY"/>
+        </w:rPr>
+        <w:t xml:space="preserve">версии плана отдаем </w:t>
+      </w:r>
+      <w:r>
+        <w:rPr>
+          <w:rFonts w:ascii="Times New Roman" w:hAnsi="Times New Roman" w:cs="Times New Roman"/>
+          <w:sz w:val="30"/>
+          <w:szCs w:val="30"/>
+          <w:lang w:val="ru-BY"/>
+        </w:rPr>
+        <w:t>подробности финансовой части (</w:t>
+      </w:r>
+      <w:r>
+        <w:rPr>
+          <w:rFonts w:ascii="Times New Roman" w:hAnsi="Times New Roman" w:cs="Times New Roman"/>
+          <w:sz w:val="30"/>
+          <w:szCs w:val="30"/>
+          <w:lang w:val="ru-BY"/>
+        </w:rPr>
+        <w:t>BudgetCosts</w:t>
+      </w:r>
+      <w:r>
+        <w:rPr>
+          <w:rFonts w:ascii="Times New Roman" w:hAnsi="Times New Roman" w:cs="Times New Roman"/>
+          <w:sz w:val="30"/>
+          <w:szCs w:val="30"/>
+          <w:lang w:val="ru-BY"/>
+        </w:rPr>
+        <w:t>)</w:t>
+      </w:r>
+      <w:r>
+        <w:rPr>
+          <w:rFonts w:ascii="Times New Roman" w:hAnsi="Times New Roman" w:cs="Times New Roman"/>
+          <w:sz w:val="30"/>
+          <w:szCs w:val="30"/>
+          <w:lang w:val="en-US"/>
+        </w:rPr>
+        <w:t xml:space="preserve">: plan_version, </w:t>
+      </w:r>
+      <w:r>
+        <w:rPr>
+          <w:rFonts w:ascii="Times New Roman" w:hAnsi="Times New Roman" w:cs="Times New Roman"/>
+          <w:sz w:val="30"/>
+          <w:szCs w:val="30"/>
+          <w:lang w:val="en-US"/>
+        </w:rPr>
+        <w:t>purchases_items_id</w:t>
+      </w:r>
+      <w:r>
+        <w:rPr>
+          <w:rFonts w:ascii="Times New Roman" w:hAnsi="Times New Roman" w:cs="Times New Roman"/>
+          <w:sz w:val="30"/>
+          <w:szCs w:val="30"/>
+          <w:lang w:val="en-US"/>
         </w:rPr>
         <w:t xml:space="preserve">, </w:t>
       </w:r>
-      <w:proofErr w:type="spellStart"/>
-      <w:r>
-        <w:rPr>
-          <w:rFonts w:ascii="Times New Roman" w:hAnsi="Times New Roman" w:cs="Times New Roman"/>
-          <w:sz w:val="30"/>
-          <w:szCs w:val="30"/>
-          <w:lang w:val="ru-BY"/>
-        </w:rPr>
-        <w:t>created_at</w:t>
-      </w:r>
-      <w:proofErr w:type="spellEnd"/>
-      <w:r>
-        <w:rPr>
-          <w:rFonts w:ascii="Times New Roman" w:hAnsi="Times New Roman" w:cs="Times New Roman"/>
-          <w:sz w:val="30"/>
-          <w:szCs w:val="30"/>
-          <w:lang w:val="ru-BY"/>
+      <w:r>
+        <w:rPr>
+          <w:rFonts w:ascii="Times New Roman" w:hAnsi="Times New Roman" w:cs="Times New Roman"/>
+          <w:sz w:val="30"/>
+          <w:szCs w:val="30"/>
+          <w:lang w:val="en-US"/>
+        </w:rPr>
+        <w:t>year</w:t>
+      </w:r>
+      <w:r>
+        <w:rPr>
+          <w:rFonts w:ascii="Times New Roman" w:hAnsi="Times New Roman" w:cs="Times New Roman"/>
+          <w:sz w:val="30"/>
+          <w:szCs w:val="30"/>
+          <w:lang w:val="en-US"/>
         </w:rPr>
         <w:t xml:space="preserve">, </w:t>
       </w:r>
-      <w:proofErr w:type="spellStart"/>
-      <w:r>
-        <w:rPr>
-          <w:rFonts w:ascii="Times New Roman" w:hAnsi="Times New Roman" w:cs="Times New Roman"/>
-          <w:sz w:val="30"/>
-          <w:szCs w:val="30"/>
-          <w:lang w:val="ru-BY"/>
-        </w:rPr>
-        <w:t>changed_at</w:t>
-      </w:r>
-      <w:proofErr w:type="spellEnd"/>
-      <w:r>
-        <w:rPr>
-          <w:rFonts w:ascii="Times New Roman" w:hAnsi="Times New Roman" w:cs="Times New Roman"/>
-          <w:sz w:val="30"/>
-          <w:szCs w:val="30"/>
-          <w:lang w:val="ru-BY"/>
+      <w:r>
+        <w:rPr>
+          <w:rFonts w:ascii="Times New Roman" w:hAnsi="Times New Roman" w:cs="Times New Roman"/>
+          <w:sz w:val="30"/>
+          <w:szCs w:val="30"/>
+          <w:lang w:val="en-US"/>
+        </w:rPr>
+        <w:lastRenderedPageBreak/>
+        <w:t>cost</w:t>
+      </w:r>
+      <w:r>
+        <w:rPr>
+          <w:rFonts w:ascii="Times New Roman" w:hAnsi="Times New Roman" w:cs="Times New Roman"/>
+          <w:sz w:val="30"/>
+          <w:szCs w:val="30"/>
+          <w:lang w:val="en-US"/>
         </w:rPr>
         <w:t xml:space="preserve">, </w:t>
       </w:r>
-      <w:proofErr w:type="spellStart"/>
-      <w:r>
-        <w:rPr>
-          <w:rFonts w:ascii="Times New Roman" w:hAnsi="Times New Roman" w:cs="Times New Roman"/>
-          <w:sz w:val="30"/>
-          <w:szCs w:val="30"/>
-          <w:lang w:val="ru-BY"/>
-        </w:rPr>
-        <w:t>changed_by</w:t>
-      </w:r>
-      <w:proofErr w:type="spellEnd"/>
-      <w:r>
-        <w:rPr>
-          <w:rFonts w:ascii="Times New Roman" w:hAnsi="Times New Roman" w:cs="Times New Roman"/>
-          <w:sz w:val="30"/>
-          <w:szCs w:val="30"/>
-          <w:lang w:val="ru-BY"/>
+      <w:r>
+        <w:rPr>
+          <w:rFonts w:ascii="Times New Roman" w:hAnsi="Times New Roman" w:cs="Times New Roman"/>
+          <w:sz w:val="30"/>
+          <w:szCs w:val="30"/>
+          <w:lang w:val="en-US"/>
+        </w:rPr>
+        <w:t>functional_class</w:t>
+      </w:r>
+      <w:r>
+        <w:rPr>
+          <w:rFonts w:ascii="Times New Roman" w:hAnsi="Times New Roman" w:cs="Times New Roman"/>
+          <w:sz w:val="30"/>
+          <w:szCs w:val="30"/>
+          <w:lang w:val="en-US"/>
         </w:rPr>
         <w:t xml:space="preserve">, </w:t>
       </w:r>
-      <w:proofErr w:type="spellStart"/>
-      <w:r>
-        <w:rPr>
-          <w:rFonts w:ascii="Times New Roman" w:hAnsi="Times New Roman" w:cs="Times New Roman"/>
-          <w:sz w:val="30"/>
-          <w:szCs w:val="30"/>
-          <w:lang w:val="ru-BY"/>
-        </w:rPr>
-        <w:t>is_active</w:t>
-      </w:r>
-      <w:proofErr w:type="spellEnd"/>
-      <w:r>
-        <w:rPr>
-          <w:rFonts w:ascii="Times New Roman" w:hAnsi="Times New Roman" w:cs="Times New Roman"/>
-          <w:sz w:val="30"/>
-          <w:szCs w:val="30"/>
-          <w:lang w:val="ru-BY"/>
+      <w:r>
+        <w:rPr>
+          <w:rFonts w:ascii="Times New Roman" w:hAnsi="Times New Roman" w:cs="Times New Roman"/>
+          <w:sz w:val="30"/>
+          <w:szCs w:val="30"/>
+          <w:lang w:val="en-US"/>
+        </w:rPr>
+        <w:t>external_economic_class</w:t>
+      </w:r>
+      <w:r>
+        <w:rPr>
+          <w:rFonts w:ascii="Times New Roman" w:hAnsi="Times New Roman" w:cs="Times New Roman"/>
+          <w:sz w:val="30"/>
+          <w:szCs w:val="30"/>
+          <w:lang w:val="en-US"/>
         </w:rPr>
         <w:t xml:space="preserve">, </w:t>
       </w:r>
-      <w:proofErr w:type="spellStart"/>
-      <w:r>
-        <w:rPr>
-          <w:rFonts w:ascii="Times New Roman" w:hAnsi="Times New Roman" w:cs="Times New Roman"/>
-          <w:sz w:val="30"/>
-          <w:szCs w:val="30"/>
-          <w:lang w:val="ru-BY"/>
-        </w:rPr>
-        <w:t>plan_goszakupki_id</w:t>
-      </w:r>
-      <w:proofErr w:type="spellEnd"/>
-      <w:r>
-        <w:rPr>
-          <w:rFonts w:ascii="Times New Roman" w:hAnsi="Times New Roman" w:cs="Times New Roman"/>
-          <w:sz w:val="30"/>
-          <w:szCs w:val="30"/>
-          <w:lang w:val="ru-BY"/>
+      <w:r>
+        <w:rPr>
+          <w:rFonts w:ascii="Times New Roman" w:hAnsi="Times New Roman" w:cs="Times New Roman"/>
+          <w:sz w:val="30"/>
+          <w:szCs w:val="30"/>
+          <w:lang w:val="en-US"/>
+        </w:rPr>
+        <w:t>program_class</w:t>
+      </w:r>
+      <w:r>
+        <w:rPr>
+          <w:rFonts w:ascii="Times New Roman" w:hAnsi="Times New Roman" w:cs="Times New Roman"/>
+          <w:sz w:val="30"/>
+          <w:szCs w:val="30"/>
+          <w:lang w:val="en-US"/>
         </w:rPr>
         <w:t xml:space="preserve">, </w:t>
       </w:r>
-      <w:proofErr w:type="spellStart"/>
-      <w:r>
-        <w:rPr>
-          <w:rFonts w:ascii="Times New Roman" w:hAnsi="Times New Roman" w:cs="Times New Roman"/>
-          <w:sz w:val="30"/>
-          <w:szCs w:val="30"/>
-          <w:lang w:val="ru-BY"/>
-        </w:rPr>
-        <w:t>purchases_id</w:t>
-      </w:r>
-      <w:proofErr w:type="spellEnd"/>
-      <w:r>
-        <w:rPr>
-          <w:rFonts w:ascii="Times New Roman" w:hAnsi="Times New Roman" w:cs="Times New Roman"/>
-          <w:sz w:val="30"/>
-          <w:szCs w:val="30"/>
-          <w:lang w:val="ru-BY"/>
+      <w:r>
+        <w:rPr>
+          <w:rFonts w:ascii="Times New Roman" w:hAnsi="Times New Roman" w:cs="Times New Roman"/>
+          <w:sz w:val="30"/>
+          <w:szCs w:val="30"/>
+          <w:lang w:val="en-US"/>
+        </w:rPr>
+        <w:t>department_code</w:t>
+      </w:r>
+      <w:r>
+        <w:rPr>
+          <w:rFonts w:ascii="Times New Roman" w:hAnsi="Times New Roman" w:cs="Times New Roman"/>
+          <w:sz w:val="30"/>
+          <w:szCs w:val="30"/>
+          <w:lang w:val="en-US"/>
         </w:rPr>
         <w:t xml:space="preserve">, </w:t>
       </w:r>
-      <w:proofErr w:type="spellStart"/>
-      <w:r>
-        <w:rPr>
-          <w:rFonts w:ascii="Times New Roman" w:hAnsi="Times New Roman" w:cs="Times New Roman"/>
-          <w:sz w:val="30"/>
-          <w:szCs w:val="30"/>
-          <w:lang w:val="ru-BY"/>
-        </w:rPr>
-        <w:t>unp_budget</w:t>
-      </w:r>
-      <w:proofErr w:type="spellEnd"/>
-      <w:r>
-        <w:rPr>
-          <w:rFonts w:ascii="Times New Roman" w:hAnsi="Times New Roman" w:cs="Times New Roman"/>
-          <w:sz w:val="30"/>
-          <w:szCs w:val="30"/>
-          <w:lang w:val="ru-BY"/>
+      <w:r>
+        <w:rPr>
+          <w:rFonts w:ascii="Times New Roman" w:hAnsi="Times New Roman" w:cs="Times New Roman"/>
+          <w:sz w:val="30"/>
+          <w:szCs w:val="30"/>
+          <w:lang w:val="en-US"/>
+        </w:rPr>
+        <w:t>budget_code</w:t>
+      </w:r>
+      <w:r>
+        <w:rPr>
+          <w:rFonts w:ascii="Times New Roman" w:hAnsi="Times New Roman" w:cs="Times New Roman"/>
+          <w:sz w:val="30"/>
+          <w:szCs w:val="30"/>
+          <w:lang w:val="en-US"/>
         </w:rPr>
         <w:t xml:space="preserve">, </w:t>
       </w:r>
-      <w:proofErr w:type="spellStart"/>
-      <w:r>
-        <w:rPr>
-          <w:rFonts w:ascii="Times New Roman" w:hAnsi="Times New Roman" w:cs="Times New Roman"/>
-          <w:sz w:val="30"/>
-          <w:szCs w:val="30"/>
-          <w:lang w:val="ru-BY"/>
-        </w:rPr>
-        <w:t>title</w:t>
-      </w:r>
-      <w:proofErr w:type="spellEnd"/>
-      <w:r>
-        <w:rPr>
-          <w:rFonts w:ascii="Times New Roman" w:hAnsi="Times New Roman" w:cs="Times New Roman"/>
-          <w:sz w:val="30"/>
-          <w:szCs w:val="30"/>
-          <w:lang w:val="ru-BY"/>
+      <w:r>
+        <w:rPr>
+          <w:rFonts w:ascii="Times New Roman" w:hAnsi="Times New Roman" w:cs="Times New Roman"/>
+          <w:sz w:val="30"/>
+          <w:szCs w:val="30"/>
+          <w:lang w:val="en-US"/>
+        </w:rPr>
+        <w:t>budget_code_name</w:t>
+      </w:r>
+      <w:r>
+        <w:rPr>
+          <w:rFonts w:ascii="Times New Roman" w:hAnsi="Times New Roman" w:cs="Times New Roman"/>
+          <w:sz w:val="30"/>
+          <w:szCs w:val="30"/>
+          <w:lang w:val="en-US"/>
         </w:rPr>
         <w:t xml:space="preserve">, </w:t>
       </w:r>
-      <w:proofErr w:type="spellStart"/>
-      <w:r>
-        <w:rPr>
-          <w:rFonts w:ascii="Times New Roman" w:hAnsi="Times New Roman" w:cs="Times New Roman"/>
-          <w:sz w:val="30"/>
-          <w:szCs w:val="30"/>
-          <w:lang w:val="ru-BY"/>
-        </w:rPr>
-        <w:t>okrb</w:t>
-      </w:r>
-      <w:proofErr w:type="spellEnd"/>
-      <w:r>
-        <w:rPr>
-          <w:rFonts w:ascii="Times New Roman" w:hAnsi="Times New Roman" w:cs="Times New Roman"/>
-          <w:sz w:val="30"/>
-          <w:szCs w:val="30"/>
-          <w:lang w:val="ru-BY"/>
+      <w:r>
+        <w:rPr>
+          <w:rFonts w:ascii="Times New Roman" w:hAnsi="Times New Roman" w:cs="Times New Roman"/>
+          <w:sz w:val="30"/>
+          <w:szCs w:val="30"/>
+          <w:lang w:val="en-US"/>
+        </w:rPr>
+        <w:t>unk</w:t>
+      </w:r>
+      <w:r>
+        <w:rPr>
+          <w:rFonts w:ascii="Times New Roman" w:hAnsi="Times New Roman" w:cs="Times New Roman"/>
+          <w:sz w:val="30"/>
+          <w:szCs w:val="30"/>
+          <w:lang w:val="en-US"/>
         </w:rPr>
         <w:t xml:space="preserve">, </w:t>
       </w:r>
-      <w:proofErr w:type="spellStart"/>
-      <w:r>
-        <w:rPr>
-          <w:rFonts w:ascii="Times New Roman" w:hAnsi="Times New Roman" w:cs="Times New Roman"/>
-          <w:sz w:val="30"/>
-          <w:szCs w:val="30"/>
-          <w:lang w:val="ru-BY"/>
-        </w:rPr>
-        <w:t>okrb_title</w:t>
-      </w:r>
-      <w:proofErr w:type="spellEnd"/>
-      <w:r>
-        <w:rPr>
-          <w:rFonts w:ascii="Times New Roman" w:hAnsi="Times New Roman" w:cs="Times New Roman"/>
-          <w:sz w:val="30"/>
-          <w:szCs w:val="30"/>
-          <w:lang w:val="ru-BY"/>
+      <w:r>
+        <w:rPr>
+          <w:rFonts w:ascii="Times New Roman" w:hAnsi="Times New Roman" w:cs="Times New Roman"/>
+          <w:sz w:val="30"/>
+          <w:szCs w:val="30"/>
+          <w:lang w:val="en-US"/>
+        </w:rPr>
+        <w:t>tk_id</w:t>
+      </w:r>
+      <w:r>
+        <w:rPr>
+          <w:rFonts w:ascii="Times New Roman" w:hAnsi="Times New Roman" w:cs="Times New Roman"/>
+          <w:sz w:val="30"/>
+          <w:szCs w:val="30"/>
+          <w:lang w:val="en-US"/>
         </w:rPr>
         <w:t xml:space="preserve">, </w:t>
       </w:r>
-      <w:proofErr w:type="spellStart"/>
-      <w:r>
-        <w:rPr>
-          <w:rFonts w:ascii="Times New Roman" w:hAnsi="Times New Roman" w:cs="Times New Roman"/>
-          <w:sz w:val="30"/>
-          <w:szCs w:val="30"/>
-          <w:lang w:val="ru-BY"/>
-        </w:rPr>
-        <w:t>okrb_product</w:t>
-      </w:r>
-      <w:proofErr w:type="spellEnd"/>
-      <w:r>
-        <w:rPr>
-          <w:rFonts w:ascii="Times New Roman" w:hAnsi="Times New Roman" w:cs="Times New Roman"/>
-          <w:sz w:val="30"/>
-          <w:szCs w:val="30"/>
-          <w:lang w:val="ru-BY"/>
+      <w:r>
+        <w:rPr>
+          <w:rFonts w:ascii="Times New Roman" w:hAnsi="Times New Roman" w:cs="Times New Roman"/>
+          <w:sz w:val="30"/>
+          <w:szCs w:val="30"/>
+          <w:lang w:val="en-US"/>
+        </w:rPr>
+        <w:t>economic_class</w:t>
+      </w:r>
+      <w:r>
+        <w:rPr>
+          <w:rFonts w:ascii="Times New Roman" w:hAnsi="Times New Roman" w:cs="Times New Roman"/>
+          <w:sz w:val="30"/>
+          <w:szCs w:val="30"/>
+          <w:lang w:val="en-US"/>
         </w:rPr>
         <w:t xml:space="preserve">, </w:t>
       </w:r>
-      <w:proofErr w:type="spellStart"/>
-      <w:r>
-        <w:rPr>
-          <w:rFonts w:ascii="Times New Roman" w:hAnsi="Times New Roman" w:cs="Times New Roman"/>
-          <w:sz w:val="30"/>
-          <w:szCs w:val="30"/>
-          <w:lang w:val="ru-BY"/>
-        </w:rPr>
-        <w:t>type</w:t>
-      </w:r>
-      <w:proofErr w:type="spellEnd"/>
-      <w:r>
-        <w:rPr>
-          <w:rFonts w:ascii="Times New Roman" w:hAnsi="Times New Roman" w:cs="Times New Roman"/>
-          <w:sz w:val="30"/>
-          <w:szCs w:val="30"/>
-          <w:lang w:val="ru-BY"/>
+      <w:r>
+        <w:rPr>
+          <w:rFonts w:ascii="Times New Roman" w:hAnsi="Times New Roman" w:cs="Times New Roman"/>
+          <w:sz w:val="30"/>
+          <w:szCs w:val="30"/>
+          <w:lang w:val="en-US"/>
+        </w:rPr>
+        <w:t>economic_section</w:t>
+      </w:r>
+      <w:r>
+        <w:rPr>
+          <w:rFonts w:ascii="Times New Roman" w:hAnsi="Times New Roman" w:cs="Times New Roman"/>
+          <w:sz w:val="30"/>
+          <w:szCs w:val="30"/>
+          <w:lang w:val="en-US"/>
         </w:rPr>
         <w:t xml:space="preserve">, </w:t>
       </w:r>
-      <w:proofErr w:type="spellStart"/>
-      <w:r>
-        <w:rPr>
-          <w:rFonts w:ascii="Times New Roman" w:hAnsi="Times New Roman" w:cs="Times New Roman"/>
-          <w:sz w:val="30"/>
-          <w:szCs w:val="30"/>
-          <w:lang w:val="ru-BY"/>
-        </w:rPr>
-        <w:t>val_amount</w:t>
-      </w:r>
-      <w:proofErr w:type="spellEnd"/>
-      <w:r>
-        <w:rPr>
-          <w:rFonts w:ascii="Times New Roman" w:hAnsi="Times New Roman" w:cs="Times New Roman"/>
-          <w:sz w:val="30"/>
-          <w:szCs w:val="30"/>
-          <w:lang w:val="ru-BY"/>
+      <w:r>
+        <w:rPr>
+          <w:rFonts w:ascii="Times New Roman" w:hAnsi="Times New Roman" w:cs="Times New Roman"/>
+          <w:sz w:val="30"/>
+          <w:szCs w:val="30"/>
+          <w:lang w:val="en-US"/>
+        </w:rPr>
+        <w:t>economic_subsection</w:t>
+      </w:r>
+      <w:r>
+        <w:rPr>
+          <w:rFonts w:ascii="Times New Roman" w:hAnsi="Times New Roman" w:cs="Times New Roman"/>
+          <w:sz w:val="30"/>
+          <w:szCs w:val="30"/>
+          <w:lang w:val="en-US"/>
         </w:rPr>
         <w:t xml:space="preserve">, </w:t>
       </w:r>
-      <w:proofErr w:type="spellStart"/>
-      <w:r>
-        <w:rPr>
-          <w:rFonts w:ascii="Times New Roman" w:hAnsi="Times New Roman" w:cs="Times New Roman"/>
-          <w:sz w:val="30"/>
-          <w:szCs w:val="30"/>
-          <w:lang w:val="ru-BY"/>
-        </w:rPr>
-        <w:t>val_type</w:t>
-      </w:r>
-      <w:proofErr w:type="spellEnd"/>
-      <w:r>
-        <w:rPr>
-          <w:rFonts w:ascii="Times New Roman" w:hAnsi="Times New Roman" w:cs="Times New Roman"/>
-          <w:sz w:val="30"/>
-          <w:szCs w:val="30"/>
-          <w:lang w:val="ru-BY"/>
+      <w:r>
+        <w:rPr>
+          <w:rFonts w:ascii="Times New Roman" w:hAnsi="Times New Roman" w:cs="Times New Roman"/>
+          <w:sz w:val="30"/>
+          <w:szCs w:val="30"/>
+          <w:lang w:val="en-US"/>
+        </w:rPr>
+        <w:t>economic_kind</w:t>
+      </w:r>
+      <w:r>
+        <w:rPr>
+          <w:rFonts w:ascii="Times New Roman" w:hAnsi="Times New Roman" w:cs="Times New Roman"/>
+          <w:sz w:val="30"/>
+          <w:szCs w:val="30"/>
+          <w:lang w:val="en-US"/>
         </w:rPr>
         <w:t xml:space="preserve">, </w:t>
       </w:r>
-      <w:proofErr w:type="spellStart"/>
-      <w:r>
-        <w:rPr>
-          <w:rFonts w:ascii="Times New Roman" w:hAnsi="Times New Roman" w:cs="Times New Roman"/>
-          <w:sz w:val="30"/>
-          <w:szCs w:val="30"/>
-          <w:lang w:val="ru-BY"/>
-        </w:rPr>
-        <w:t>val_unit</w:t>
-      </w:r>
-      <w:proofErr w:type="spellEnd"/>
-      <w:r>
-        <w:rPr>
-          <w:rFonts w:ascii="Times New Roman" w:hAnsi="Times New Roman" w:cs="Times New Roman"/>
-          <w:sz w:val="30"/>
-          <w:szCs w:val="30"/>
-          <w:lang w:val="ru-BY"/>
-        </w:rPr>
-        <w:t xml:space="preserve">, </w:t>
-      </w:r>
-      <w:proofErr w:type="spellStart"/>
-      <w:r>
-        <w:rPr>
-          <w:rFonts w:ascii="Times New Roman" w:hAnsi="Times New Roman" w:cs="Times New Roman"/>
-          <w:sz w:val="30"/>
-          <w:szCs w:val="30"/>
-          <w:lang w:val="ru-BY"/>
-        </w:rPr>
-        <w:t>fund_cost</w:t>
-      </w:r>
-      <w:proofErr w:type="spellEnd"/>
-      <w:r>
-        <w:rPr>
-          <w:rFonts w:ascii="Times New Roman" w:hAnsi="Times New Roman" w:cs="Times New Roman"/>
-          <w:sz w:val="30"/>
-          <w:szCs w:val="30"/>
-          <w:lang w:val="ru-BY"/>
-        </w:rPr>
-        <w:t xml:space="preserve">, </w:t>
-      </w:r>
-      <w:proofErr w:type="spellStart"/>
-      <w:r>
-        <w:rPr>
-          <w:rFonts w:ascii="Times New Roman" w:hAnsi="Times New Roman" w:cs="Times New Roman"/>
-          <w:sz w:val="30"/>
-          <w:szCs w:val="30"/>
-          <w:lang w:val="ru-BY"/>
-        </w:rPr>
-        <w:t>inner_cost</w:t>
-      </w:r>
-      <w:proofErr w:type="spellEnd"/>
-      <w:r>
-        <w:rPr>
-          <w:rFonts w:ascii="Times New Roman" w:hAnsi="Times New Roman" w:cs="Times New Roman"/>
-          <w:sz w:val="30"/>
-          <w:szCs w:val="30"/>
-          <w:lang w:val="ru-BY"/>
-        </w:rPr>
-        <w:t xml:space="preserve">, </w:t>
-      </w:r>
-      <w:proofErr w:type="spellStart"/>
-      <w:r>
-        <w:rPr>
-          <w:rFonts w:ascii="Times New Roman" w:hAnsi="Times New Roman" w:cs="Times New Roman"/>
-          <w:sz w:val="30"/>
-          <w:szCs w:val="30"/>
-          <w:lang w:val="ru-BY"/>
-        </w:rPr>
-        <w:t>val_currency</w:t>
-      </w:r>
-      <w:proofErr w:type="spellEnd"/>
-      <w:r>
-        <w:rPr>
-          <w:rFonts w:ascii="Times New Roman" w:hAnsi="Times New Roman" w:cs="Times New Roman"/>
-          <w:sz w:val="30"/>
-          <w:szCs w:val="30"/>
-          <w:lang w:val="ru-BY"/>
-        </w:rPr>
-        <w:t xml:space="preserve">, </w:t>
-      </w:r>
-      <w:proofErr w:type="spellStart"/>
-      <w:r>
-        <w:rPr>
-          <w:rFonts w:ascii="Times New Roman" w:hAnsi="Times New Roman" w:cs="Times New Roman"/>
-          <w:sz w:val="30"/>
-          <w:szCs w:val="30"/>
-          <w:lang w:val="ru-BY"/>
-        </w:rPr>
-        <w:t>procedure_months</w:t>
-      </w:r>
-      <w:proofErr w:type="spellEnd"/>
-      <w:r>
-        <w:rPr>
-          <w:rFonts w:ascii="Times New Roman" w:hAnsi="Times New Roman" w:cs="Times New Roman"/>
-          <w:sz w:val="30"/>
-          <w:szCs w:val="30"/>
-          <w:lang w:val="ru-BY"/>
-        </w:rPr>
-        <w:t xml:space="preserve">, </w:t>
-      </w:r>
-      <w:proofErr w:type="spellStart"/>
-      <w:r>
-        <w:rPr>
-          <w:rFonts w:ascii="Times New Roman" w:hAnsi="Times New Roman" w:cs="Times New Roman"/>
-          <w:sz w:val="30"/>
-          <w:szCs w:val="30"/>
-          <w:lang w:val="ru-BY"/>
-        </w:rPr>
-        <w:t>is_by_organizator</w:t>
-      </w:r>
-      <w:proofErr w:type="spellEnd"/>
-    </w:p>
-    <w:p>
-      <w:pPr>
-        <w:ind w:firstLine="720"/>
-        <w:rPr>
-          <w:rFonts w:ascii="Times New Roman" w:hAnsi="Times New Roman" w:cs="Times New Roman"/>
-          <w:sz w:val="30"/>
-          <w:szCs w:val="30"/>
-          <w:lang w:val="ru-BY"/>
-        </w:rPr>
-      </w:pPr>
-      <w:r>
-        <w:rPr>
-          <w:rFonts w:ascii="Times New Roman" w:hAnsi="Times New Roman" w:cs="Times New Roman"/>
-          <w:sz w:val="30"/>
-          <w:szCs w:val="30"/>
-          <w:lang w:val="ru-BY"/>
-        </w:rPr>
-        <w:t>3. </w:t>
-      </w:r>
-      <w:r>
-        <w:rPr>
-          <w:rFonts w:ascii="Times New Roman" w:hAnsi="Times New Roman" w:cs="Times New Roman"/>
-          <w:sz w:val="30"/>
-          <w:szCs w:val="30"/>
-          <w:lang w:val="ru-BY"/>
-        </w:rPr>
-        <w:t xml:space="preserve">При отображении (сериализации) отдаем </w:t>
-      </w:r>
-      <w:r>
-        <w:rPr>
-          <w:rFonts w:ascii="Times New Roman" w:hAnsi="Times New Roman" w:cs="Times New Roman"/>
-          <w:sz w:val="30"/>
-          <w:szCs w:val="30"/>
-          <w:lang w:val="ru-BY"/>
-        </w:rPr>
-        <w:t>КОРНЕВЫЕ пункты</w:t>
-      </w:r>
-      <w:r>
-        <w:rPr>
-          <w:rFonts w:ascii="Times New Roman" w:hAnsi="Times New Roman" w:cs="Times New Roman"/>
-          <w:sz w:val="30"/>
-          <w:szCs w:val="30"/>
-          <w:lang w:val="ru-BY"/>
-        </w:rPr>
-        <w:t xml:space="preserve"> (</w:t>
-      </w:r>
-      <w:r>
-        <w:rPr>
-          <w:rFonts w:ascii="Times New Roman" w:hAnsi="Times New Roman" w:cs="Times New Roman"/>
-          <w:sz w:val="30"/>
-          <w:szCs w:val="30"/>
-          <w:lang w:val="ru-BY"/>
-        </w:rPr>
-        <w:t>ACTIVE</w:t>
-      </w:r>
-      <w:r>
-        <w:rPr>
-          <w:lang w:val="ru-BY"/>
-        </w:rPr>
-        <w:t xml:space="preserve"> </w:t>
-      </w:r>
-      <w:r>
-        <w:rPr>
-          <w:lang w:val="ru-BY"/>
-        </w:rPr>
-        <w:t xml:space="preserve">и </w:t>
-      </w:r>
-      <w:r>
-        <w:rPr>
-          <w:rFonts w:ascii="Times New Roman" w:hAnsi="Times New Roman" w:cs="Times New Roman"/>
-          <w:sz w:val="30"/>
-          <w:szCs w:val="30"/>
-          <w:lang w:val="ru-BY"/>
-        </w:rPr>
-        <w:t>PUBLISHED</w:t>
-      </w:r>
-      <w:r>
-        <w:rPr>
-          <w:rFonts w:ascii="Times New Roman" w:hAnsi="Times New Roman" w:cs="Times New Roman"/>
-          <w:sz w:val="30"/>
-          <w:szCs w:val="30"/>
-          <w:lang w:val="ru-BY"/>
-        </w:rPr>
-        <w:t>)</w:t>
-      </w:r>
-      <w:r>
-        <w:rPr>
-          <w:rFonts w:ascii="Times New Roman" w:hAnsi="Times New Roman" w:cs="Times New Roman"/>
-          <w:sz w:val="30"/>
-          <w:szCs w:val="30"/>
-          <w:lang w:val="ru-BY"/>
-        </w:rPr>
-        <w:t xml:space="preserve"> и все</w:t>
-      </w:r>
-      <w:r>
-        <w:rPr>
-          <w:rFonts w:ascii="Times New Roman" w:hAnsi="Times New Roman" w:cs="Times New Roman"/>
-          <w:sz w:val="30"/>
-          <w:szCs w:val="30"/>
-          <w:lang w:val="ru-BY"/>
-        </w:rPr>
-        <w:t xml:space="preserve"> </w:t>
-      </w:r>
-      <w:r>
-        <w:rPr>
-          <w:rFonts w:ascii="Times New Roman" w:hAnsi="Times New Roman" w:cs="Times New Roman"/>
-          <w:sz w:val="30"/>
-          <w:szCs w:val="30"/>
-          <w:lang w:val="ru-BY"/>
-        </w:rPr>
-        <w:t>связанные с ними</w:t>
-      </w:r>
-      <w:r>
-        <w:rPr>
-          <w:rFonts w:ascii="Times New Roman" w:hAnsi="Times New Roman" w:cs="Times New Roman"/>
-          <w:sz w:val="30"/>
-          <w:szCs w:val="30"/>
-          <w:lang w:val="ru-BY"/>
-        </w:rPr>
-        <w:t xml:space="preserve"> </w:t>
-      </w:r>
-      <w:r>
-        <w:rPr>
-          <w:rFonts w:ascii="Times New Roman" w:hAnsi="Times New Roman" w:cs="Times New Roman"/>
-          <w:sz w:val="30"/>
-          <w:szCs w:val="30"/>
-          <w:lang w:val="ru-BY"/>
-        </w:rPr>
-        <w:t>ПОДРОБНЫЕ</w:t>
-      </w:r>
-      <w:r>
-        <w:rPr>
-          <w:rFonts w:ascii="Times New Roman" w:hAnsi="Times New Roman" w:cs="Times New Roman"/>
-          <w:sz w:val="30"/>
-          <w:szCs w:val="30"/>
-          <w:lang w:val="ru-BY"/>
-        </w:rPr>
-        <w:t xml:space="preserve"> </w:t>
-      </w:r>
-      <w:r>
-        <w:rPr>
-          <w:rFonts w:ascii="Times New Roman" w:hAnsi="Times New Roman" w:cs="Times New Roman"/>
-          <w:sz w:val="30"/>
-          <w:szCs w:val="30"/>
-          <w:lang w:val="ru-BY"/>
-        </w:rPr>
-        <w:t>версии</w:t>
-      </w:r>
-      <w:r>
-        <w:rPr>
-          <w:rFonts w:ascii="Times New Roman" w:hAnsi="Times New Roman" w:cs="Times New Roman"/>
-          <w:sz w:val="30"/>
-          <w:szCs w:val="30"/>
-          <w:lang w:val="ru-BY"/>
-        </w:rPr>
-        <w:t xml:space="preserve"> </w:t>
-      </w:r>
-      <w:r>
-        <w:rPr>
-          <w:rFonts w:ascii="Times New Roman" w:hAnsi="Times New Roman" w:cs="Times New Roman"/>
-          <w:sz w:val="30"/>
-          <w:szCs w:val="30"/>
-          <w:lang w:val="ru-BY"/>
-        </w:rPr>
-        <w:t>или только</w:t>
-      </w:r>
-      <w:r>
-        <w:rPr>
-          <w:rFonts w:ascii="Times New Roman" w:hAnsi="Times New Roman" w:cs="Times New Roman"/>
-          <w:sz w:val="30"/>
-          <w:szCs w:val="30"/>
-          <w:lang w:val="ru-BY"/>
-        </w:rPr>
-        <w:t xml:space="preserve"> </w:t>
-      </w:r>
-      <w:r>
-        <w:rPr>
-          <w:rFonts w:ascii="Times New Roman" w:hAnsi="Times New Roman" w:cs="Times New Roman"/>
-          <w:sz w:val="30"/>
-          <w:szCs w:val="30"/>
-          <w:lang w:val="ru-BY"/>
-        </w:rPr>
-        <w:t>последнюю</w:t>
-      </w:r>
-      <w:r>
-        <w:rPr>
-          <w:rFonts w:ascii="Times New Roman" w:hAnsi="Times New Roman" w:cs="Times New Roman"/>
-          <w:sz w:val="30"/>
-          <w:szCs w:val="30"/>
-          <w:lang w:val="ru-BY"/>
-        </w:rPr>
-        <w:t xml:space="preserve"> (</w:t>
-      </w:r>
-      <w:r>
-        <w:rPr>
-          <w:rFonts w:ascii="Times New Roman" w:hAnsi="Times New Roman" w:cs="Times New Roman"/>
-          <w:sz w:val="30"/>
-          <w:szCs w:val="30"/>
-          <w:lang w:val="ru-BY"/>
-        </w:rPr>
-        <w:t>а</w:t>
-      </w:r>
-      <w:r>
-        <w:rPr>
-          <w:rFonts w:ascii="Times New Roman" w:hAnsi="Times New Roman" w:cs="Times New Roman"/>
-          <w:sz w:val="30"/>
-          <w:szCs w:val="30"/>
-          <w:lang w:val="ru-BY"/>
-        </w:rPr>
-        <w:t>ктивную?</w:t>
-      </w:r>
-      <w:r>
-        <w:rPr>
-          <w:rFonts w:ascii="Times New Roman" w:hAnsi="Times New Roman" w:cs="Times New Roman"/>
-          <w:sz w:val="30"/>
-          <w:szCs w:val="30"/>
-          <w:lang w:val="ru-BY"/>
-        </w:rPr>
-        <w:t>)</w:t>
-      </w:r>
-    </w:p>
-    <w:p>
-      <w:pPr>
-        <w:ind w:firstLine="720"/>
+      <w:r>
         <w:rPr>
           <w:rFonts w:ascii="Times New Roman" w:hAnsi="Times New Roman" w:cs="Times New Roman"/>
           <w:sz w:val="30"/>
           <w:szCs w:val="30"/>
           <w:lang w:val="en-US"/>
         </w:rPr>
-      </w:pPr>
-      <w:r>
-        <w:rPr>
-          <w:rFonts w:ascii="Times New Roman" w:hAnsi="Times New Roman" w:cs="Times New Roman"/>
-          <w:sz w:val="30"/>
-          <w:szCs w:val="30"/>
-          <w:lang w:val="ru-BY"/>
-        </w:rPr>
-        <w:t xml:space="preserve">4. В каждой </w:t>
-      </w:r>
-      <w:r>
-        <w:rPr>
-          <w:rFonts w:ascii="Times New Roman" w:hAnsi="Times New Roman" w:cs="Times New Roman"/>
-          <w:sz w:val="30"/>
-          <w:szCs w:val="30"/>
-          <w:lang w:val="ru-BY"/>
-        </w:rPr>
-        <w:t>ПОДРОБН</w:t>
-      </w:r>
-      <w:r>
-        <w:rPr>
-          <w:rFonts w:ascii="Times New Roman" w:hAnsi="Times New Roman" w:cs="Times New Roman"/>
-          <w:sz w:val="30"/>
-          <w:szCs w:val="30"/>
-          <w:lang w:val="ru-BY"/>
-        </w:rPr>
-        <w:t>ОЙ</w:t>
-      </w:r>
-      <w:r>
-        <w:rPr>
-          <w:rFonts w:ascii="Times New Roman" w:hAnsi="Times New Roman" w:cs="Times New Roman"/>
-          <w:sz w:val="30"/>
-          <w:szCs w:val="30"/>
-          <w:lang w:val="ru-BY"/>
-        </w:rPr>
-        <w:t xml:space="preserve"> </w:t>
-      </w:r>
-      <w:r>
-        <w:rPr>
-          <w:rFonts w:ascii="Times New Roman" w:hAnsi="Times New Roman" w:cs="Times New Roman"/>
-          <w:sz w:val="30"/>
-          <w:szCs w:val="30"/>
-          <w:lang w:val="ru-BY"/>
-        </w:rPr>
-        <w:t>версии</w:t>
-      </w:r>
-      <w:r>
-        <w:rPr>
-          <w:rFonts w:ascii="Times New Roman" w:hAnsi="Times New Roman" w:cs="Times New Roman"/>
-          <w:sz w:val="30"/>
-          <w:szCs w:val="30"/>
-          <w:lang w:val="ru-BY"/>
-        </w:rPr>
-        <w:t xml:space="preserve"> плана отдаем </w:t>
-      </w:r>
-      <w:r>
-        <w:rPr>
-          <w:rFonts w:ascii="Times New Roman" w:hAnsi="Times New Roman" w:cs="Times New Roman"/>
-          <w:sz w:val="30"/>
-          <w:szCs w:val="30"/>
-          <w:lang w:val="ru-BY"/>
-        </w:rPr>
-        <w:t>подробности финансовой части (</w:t>
-      </w:r>
-      <w:proofErr w:type="spellStart"/>
-      <w:r>
-        <w:rPr>
-          <w:rFonts w:ascii="Times New Roman" w:hAnsi="Times New Roman" w:cs="Times New Roman"/>
-          <w:sz w:val="30"/>
-          <w:szCs w:val="30"/>
-          <w:lang w:val="ru-BY"/>
-        </w:rPr>
-        <w:t>BudgetCosts</w:t>
-      </w:r>
-      <w:proofErr w:type="spellEnd"/>
-      <w:r>
-        <w:rPr>
-          <w:rFonts w:ascii="Times New Roman" w:hAnsi="Times New Roman" w:cs="Times New Roman"/>
-          <w:sz w:val="30"/>
-          <w:szCs w:val="30"/>
-          <w:lang w:val="ru-BY"/>
-        </w:rPr>
-        <w:t>)</w:t>
-      </w:r>
-      <w:r>
-        <w:rPr>
-          <w:rFonts w:ascii="Times New Roman" w:hAnsi="Times New Roman" w:cs="Times New Roman"/>
-          <w:sz w:val="30"/>
-          <w:szCs w:val="30"/>
-          <w:lang w:val="en-US"/>
-        </w:rPr>
-        <w:t xml:space="preserve">: </w:t>
-      </w:r>
-      <w:r>
-        <w:rPr>
-          <w:rFonts w:ascii="Times New Roman" w:hAnsi="Times New Roman" w:cs="Times New Roman"/>
-          <w:sz w:val="30"/>
-          <w:szCs w:val="30"/>
-          <w:lang w:val="en-US"/>
-        </w:rPr>
-        <w:t>plan_version</w:t>
-      </w:r>
-      <w:r>
-        <w:rPr>
-          <w:rFonts w:ascii="Times New Roman" w:hAnsi="Times New Roman" w:cs="Times New Roman"/>
-          <w:sz w:val="30"/>
-          <w:szCs w:val="30"/>
-          <w:lang w:val="en-US"/>
-        </w:rPr>
-        <w:t xml:space="preserve">, </w:t>
-      </w:r>
-      <w:proofErr w:type="spellStart"/>
-      <w:r>
-        <w:rPr>
-          <w:rFonts w:ascii="Times New Roman" w:hAnsi="Times New Roman" w:cs="Times New Roman"/>
-          <w:sz w:val="30"/>
-          <w:szCs w:val="30"/>
-          <w:lang w:val="en-US"/>
-        </w:rPr>
-        <w:t>purchases_items_id</w:t>
-      </w:r>
-      <w:proofErr w:type="spellEnd"/>
-      <w:r>
-        <w:rPr>
-          <w:rFonts w:ascii="Times New Roman" w:hAnsi="Times New Roman" w:cs="Times New Roman"/>
-          <w:sz w:val="30"/>
-          <w:szCs w:val="30"/>
-          <w:lang w:val="en-US"/>
-        </w:rPr>
-        <w:t xml:space="preserve">, </w:t>
-      </w:r>
-      <w:r>
-        <w:rPr>
-          <w:rFonts w:ascii="Times New Roman" w:hAnsi="Times New Roman" w:cs="Times New Roman"/>
-          <w:sz w:val="30"/>
-          <w:szCs w:val="30"/>
-          <w:lang w:val="en-US"/>
-        </w:rPr>
-        <w:t>year</w:t>
-      </w:r>
-      <w:r>
-        <w:rPr>
-          <w:rFonts w:ascii="Times New Roman" w:hAnsi="Times New Roman" w:cs="Times New Roman"/>
-          <w:sz w:val="30"/>
-          <w:szCs w:val="30"/>
-          <w:lang w:val="en-US"/>
-        </w:rPr>
-        <w:t xml:space="preserve">, </w:t>
-      </w:r>
-      <w:r>
-        <w:rPr>
-          <w:rFonts w:ascii="Times New Roman" w:hAnsi="Times New Roman" w:cs="Times New Roman"/>
-          <w:sz w:val="30"/>
-          <w:szCs w:val="30"/>
-          <w:lang w:val="en-US"/>
-        </w:rPr>
-        <w:t>cost</w:t>
-      </w:r>
-      <w:r>
-        <w:rPr>
-          <w:rFonts w:ascii="Times New Roman" w:hAnsi="Times New Roman" w:cs="Times New Roman"/>
-          <w:sz w:val="30"/>
-          <w:szCs w:val="30"/>
-          <w:lang w:val="en-US"/>
-        </w:rPr>
-        <w:t xml:space="preserve">, </w:t>
-      </w:r>
-      <w:proofErr w:type="spellStart"/>
-      <w:r>
-        <w:rPr>
-          <w:rFonts w:ascii="Times New Roman" w:hAnsi="Times New Roman" w:cs="Times New Roman"/>
-          <w:sz w:val="30"/>
-          <w:szCs w:val="30"/>
-          <w:lang w:val="en-US"/>
-        </w:rPr>
-        <w:t>functional_class</w:t>
-      </w:r>
-      <w:proofErr w:type="spellEnd"/>
-      <w:r>
-        <w:rPr>
-          <w:rFonts w:ascii="Times New Roman" w:hAnsi="Times New Roman" w:cs="Times New Roman"/>
-          <w:sz w:val="30"/>
-          <w:szCs w:val="30"/>
-          <w:lang w:val="en-US"/>
-        </w:rPr>
-        <w:t xml:space="preserve">, </w:t>
-      </w:r>
-      <w:proofErr w:type="spellStart"/>
-      <w:r>
-        <w:rPr>
-          <w:rFonts w:ascii="Times New Roman" w:hAnsi="Times New Roman" w:cs="Times New Roman"/>
-          <w:sz w:val="30"/>
-          <w:szCs w:val="30"/>
-          <w:lang w:val="en-US"/>
-        </w:rPr>
-        <w:t>external_economic_class</w:t>
-      </w:r>
-      <w:proofErr w:type="spellEnd"/>
-      <w:r>
-        <w:rPr>
-          <w:rFonts w:ascii="Times New Roman" w:hAnsi="Times New Roman" w:cs="Times New Roman"/>
-          <w:sz w:val="30"/>
-          <w:szCs w:val="30"/>
-          <w:lang w:val="en-US"/>
-        </w:rPr>
-        <w:t xml:space="preserve">, </w:t>
-      </w:r>
-      <w:proofErr w:type="spellStart"/>
-      <w:r>
-        <w:rPr>
-          <w:rFonts w:ascii="Times New Roman" w:hAnsi="Times New Roman" w:cs="Times New Roman"/>
-          <w:sz w:val="30"/>
-          <w:szCs w:val="30"/>
-          <w:lang w:val="en-US"/>
-        </w:rPr>
-        <w:t>program_class</w:t>
-      </w:r>
-      <w:proofErr w:type="spellEnd"/>
-      <w:r>
-        <w:rPr>
-          <w:rFonts w:ascii="Times New Roman" w:hAnsi="Times New Roman" w:cs="Times New Roman"/>
-          <w:sz w:val="30"/>
-          <w:szCs w:val="30"/>
-          <w:lang w:val="en-US"/>
-        </w:rPr>
-        <w:t xml:space="preserve">, </w:t>
-      </w:r>
-      <w:proofErr w:type="spellStart"/>
-      <w:r>
-        <w:rPr>
-          <w:rFonts w:ascii="Times New Roman" w:hAnsi="Times New Roman" w:cs="Times New Roman"/>
-          <w:sz w:val="30"/>
-          <w:szCs w:val="30"/>
-          <w:lang w:val="en-US"/>
-        </w:rPr>
-        <w:t>department_code</w:t>
-      </w:r>
-      <w:proofErr w:type="spellEnd"/>
-      <w:r>
-        <w:rPr>
-          <w:rFonts w:ascii="Times New Roman" w:hAnsi="Times New Roman" w:cs="Times New Roman"/>
-          <w:sz w:val="30"/>
-          <w:szCs w:val="30"/>
-          <w:lang w:val="en-US"/>
-        </w:rPr>
-        <w:t xml:space="preserve">, </w:t>
-      </w:r>
-      <w:proofErr w:type="spellStart"/>
-      <w:r>
-        <w:rPr>
-          <w:rFonts w:ascii="Times New Roman" w:hAnsi="Times New Roman" w:cs="Times New Roman"/>
-          <w:sz w:val="30"/>
-          <w:szCs w:val="30"/>
-          <w:lang w:val="en-US"/>
-        </w:rPr>
-        <w:t>budget_code</w:t>
-      </w:r>
-      <w:proofErr w:type="spellEnd"/>
-      <w:r>
-        <w:rPr>
-          <w:rFonts w:ascii="Times New Roman" w:hAnsi="Times New Roman" w:cs="Times New Roman"/>
-          <w:sz w:val="30"/>
-          <w:szCs w:val="30"/>
-          <w:lang w:val="en-US"/>
-        </w:rPr>
-        <w:t xml:space="preserve">, </w:t>
-      </w:r>
-      <w:proofErr w:type="spellStart"/>
-      <w:r>
-        <w:rPr>
-          <w:rFonts w:ascii="Times New Roman" w:hAnsi="Times New Roman" w:cs="Times New Roman"/>
-          <w:sz w:val="30"/>
-          <w:szCs w:val="30"/>
-          <w:lang w:val="en-US"/>
-        </w:rPr>
-        <w:t>budget_code_name</w:t>
-      </w:r>
-      <w:proofErr w:type="spellEnd"/>
-      <w:r>
-        <w:rPr>
-          <w:rFonts w:ascii="Times New Roman" w:hAnsi="Times New Roman" w:cs="Times New Roman"/>
-          <w:sz w:val="30"/>
-          <w:szCs w:val="30"/>
-          <w:lang w:val="en-US"/>
-        </w:rPr>
-        <w:t xml:space="preserve">, </w:t>
-      </w:r>
-      <w:proofErr w:type="spellStart"/>
-      <w:r>
-        <w:rPr>
-          <w:rFonts w:ascii="Times New Roman" w:hAnsi="Times New Roman" w:cs="Times New Roman"/>
-          <w:sz w:val="30"/>
-          <w:szCs w:val="30"/>
-          <w:lang w:val="en-US"/>
-        </w:rPr>
-        <w:t>unk</w:t>
-      </w:r>
-      <w:proofErr w:type="spellEnd"/>
-      <w:r>
-        <w:rPr>
-          <w:rFonts w:ascii="Times New Roman" w:hAnsi="Times New Roman" w:cs="Times New Roman"/>
-          <w:sz w:val="30"/>
-          <w:szCs w:val="30"/>
-          <w:lang w:val="en-US"/>
-        </w:rPr>
-        <w:t xml:space="preserve">, </w:t>
-      </w:r>
-      <w:proofErr w:type="spellStart"/>
-      <w:r>
-        <w:rPr>
-          <w:rFonts w:ascii="Times New Roman" w:hAnsi="Times New Roman" w:cs="Times New Roman"/>
-          <w:sz w:val="30"/>
-          <w:szCs w:val="30"/>
-          <w:lang w:val="en-US"/>
-        </w:rPr>
-        <w:t>tk_id</w:t>
-      </w:r>
-      <w:proofErr w:type="spellEnd"/>
-      <w:r>
-        <w:rPr>
-          <w:rFonts w:ascii="Times New Roman" w:hAnsi="Times New Roman" w:cs="Times New Roman"/>
-          <w:sz w:val="30"/>
-          <w:szCs w:val="30"/>
-          <w:lang w:val="en-US"/>
-        </w:rPr>
-        <w:t xml:space="preserve">, </w:t>
-      </w:r>
-      <w:proofErr w:type="spellStart"/>
-      <w:r>
-        <w:rPr>
-          <w:rFonts w:ascii="Times New Roman" w:hAnsi="Times New Roman" w:cs="Times New Roman"/>
-          <w:sz w:val="30"/>
-          <w:szCs w:val="30"/>
-          <w:lang w:val="en-US"/>
-        </w:rPr>
-        <w:t>economic_class</w:t>
-      </w:r>
-      <w:proofErr w:type="spellEnd"/>
-      <w:r>
-        <w:rPr>
-          <w:rFonts w:ascii="Times New Roman" w:hAnsi="Times New Roman" w:cs="Times New Roman"/>
-          <w:sz w:val="30"/>
-          <w:szCs w:val="30"/>
-          <w:lang w:val="en-US"/>
-        </w:rPr>
-        <w:t xml:space="preserve">, </w:t>
-      </w:r>
-      <w:proofErr w:type="spellStart"/>
-      <w:r>
-        <w:rPr>
-          <w:rFonts w:ascii="Times New Roman" w:hAnsi="Times New Roman" w:cs="Times New Roman"/>
-          <w:sz w:val="30"/>
-          <w:szCs w:val="30"/>
-          <w:lang w:val="en-US"/>
-        </w:rPr>
-        <w:t>economic_section</w:t>
-      </w:r>
-      <w:proofErr w:type="spellEnd"/>
-      <w:r>
-        <w:rPr>
-          <w:rFonts w:ascii="Times New Roman" w:hAnsi="Times New Roman" w:cs="Times New Roman"/>
-          <w:sz w:val="30"/>
-          <w:szCs w:val="30"/>
-          <w:lang w:val="en-US"/>
-        </w:rPr>
-        <w:t xml:space="preserve">, </w:t>
-      </w:r>
-      <w:proofErr w:type="spellStart"/>
-      <w:r>
-        <w:rPr>
-          <w:rFonts w:ascii="Times New Roman" w:hAnsi="Times New Roman" w:cs="Times New Roman"/>
-          <w:sz w:val="30"/>
-          <w:szCs w:val="30"/>
-          <w:lang w:val="en-US"/>
-        </w:rPr>
-        <w:t>economic_subsection</w:t>
-      </w:r>
-      <w:proofErr w:type="spellEnd"/>
-      <w:r>
-        <w:rPr>
-          <w:rFonts w:ascii="Times New Roman" w:hAnsi="Times New Roman" w:cs="Times New Roman"/>
-          <w:sz w:val="30"/>
-          <w:szCs w:val="30"/>
-          <w:lang w:val="en-US"/>
-        </w:rPr>
-        <w:t xml:space="preserve">, </w:t>
-      </w:r>
-      <w:proofErr w:type="spellStart"/>
-      <w:r>
-        <w:rPr>
-          <w:rFonts w:ascii="Times New Roman" w:hAnsi="Times New Roman" w:cs="Times New Roman"/>
-          <w:sz w:val="30"/>
-          <w:szCs w:val="30"/>
-          <w:lang w:val="en-US"/>
-        </w:rPr>
-        <w:t>economic_kind</w:t>
-      </w:r>
-      <w:proofErr w:type="spellEnd"/>
-      <w:r>
-        <w:rPr>
-          <w:rFonts w:ascii="Times New Roman" w:hAnsi="Times New Roman" w:cs="Times New Roman"/>
-          <w:sz w:val="30"/>
-          <w:szCs w:val="30"/>
-          <w:lang w:val="en-US"/>
-        </w:rPr>
-        <w:t xml:space="preserve">, </w:t>
-      </w:r>
-      <w:proofErr w:type="spellStart"/>
-      <w:r>
-        <w:rPr>
-          <w:rFonts w:ascii="Times New Roman" w:hAnsi="Times New Roman" w:cs="Times New Roman"/>
-          <w:sz w:val="30"/>
-          <w:szCs w:val="30"/>
-          <w:lang w:val="en-US"/>
-        </w:rPr>
         <w:t>economic_article</w:t>
       </w:r>
-      <w:proofErr w:type="spellEnd"/>
     </w:p>
     <w:p>
       <w:pPr>
@@ -2568,7 +2008,6 @@
         </w:rPr>
         <w:t>1. </w:t>
       </w:r>
-      <w:proofErr w:type="spellStart"/>
       <w:r>
         <w:rPr>
           <w:rFonts w:ascii="Times New Roman" w:hAnsi="Times New Roman" w:cs="Times New Roman"/>
@@ -2577,7 +2016,6 @@
         </w:rPr>
         <w:t>Суперадмин</w:t>
       </w:r>
-      <w:proofErr w:type="spellEnd"/>
     </w:p>
     <w:p>
       <w:pPr>
@@ -3168,59 +2606,13 @@
         </w:rPr>
         <w:t xml:space="preserve">проведенного </w:t>
       </w:r>
-      <w:proofErr w:type="spellStart"/>
-      <w:r>
-        <w:rPr>
-          <w:rFonts w:ascii="Times New Roman" w:hAnsi="Times New Roman" w:cs="Times New Roman"/>
-          <w:sz w:val="30"/>
-          <w:szCs w:val="30"/>
-        </w:rPr>
-        <w:t>ретеста</w:t>
-      </w:r>
-      <w:proofErr w:type="spellEnd"/>
-      <w:r>
-        <w:rPr>
-          <w:rFonts w:ascii="Times New Roman" w:hAnsi="Times New Roman" w:cs="Times New Roman"/>
-          <w:sz w:val="30"/>
-          <w:szCs w:val="30"/>
-        </w:rPr>
-        <w:t xml:space="preserve">, дата следующего </w:t>
-      </w:r>
-      <w:proofErr w:type="spellStart"/>
-      <w:r>
-        <w:rPr>
-          <w:rFonts w:ascii="Times New Roman" w:hAnsi="Times New Roman" w:cs="Times New Roman"/>
-          <w:sz w:val="30"/>
-          <w:szCs w:val="30"/>
-        </w:rPr>
-        <w:t>ретеста</w:t>
-      </w:r>
-      <w:proofErr w:type="spellEnd"/>
-      <w:r>
-        <w:rPr>
-          <w:rFonts w:ascii="Times New Roman" w:hAnsi="Times New Roman" w:cs="Times New Roman"/>
-          <w:sz w:val="30"/>
-          <w:szCs w:val="30"/>
-        </w:rPr>
-        <w:t xml:space="preserve">, исполнитель </w:t>
-      </w:r>
-      <w:proofErr w:type="spellStart"/>
-      <w:r>
-        <w:rPr>
-          <w:rFonts w:ascii="Times New Roman" w:hAnsi="Times New Roman" w:cs="Times New Roman"/>
-          <w:sz w:val="30"/>
-          <w:szCs w:val="30"/>
-        </w:rPr>
-        <w:t>ретеста</w:t>
-      </w:r>
-      <w:proofErr w:type="spellEnd"/>
-      <w:r>
-        <w:rPr>
-          <w:rFonts w:ascii="Times New Roman" w:hAnsi="Times New Roman" w:cs="Times New Roman"/>
-          <w:sz w:val="30"/>
-          <w:szCs w:val="30"/>
-        </w:rPr>
-        <w:t>, результат контроля и заключение о годности, примечание</w:t>
+      <w:r>
+        <w:rPr>
+          <w:rFonts w:ascii="Times New Roman" w:hAnsi="Times New Roman" w:cs="Times New Roman"/>
+          <w:sz w:val="30"/>
+          <w:szCs w:val="30"/>
+        </w:rPr>
+        <w:t>ретеста, дата следующего ретеста, исполнитель ретеста, результат контроля и заключение о годности, примечание</w:t>
       </w:r>
       <w:r>
         <w:rPr>
@@ -3311,27 +2703,7 @@
           <w:szCs w:val="30"/>
           <w:lang w:val="ru-BY"/>
         </w:rPr>
-        <w:t xml:space="preserve"> уточняет у бухгалтера </w:t>
-      </w:r>
-      <w:proofErr w:type="spellStart"/>
-      <w:r>
-        <w:rPr>
-          <w:rFonts w:ascii="Times New Roman" w:hAnsi="Times New Roman" w:cs="Times New Roman"/>
-          <w:sz w:val="30"/>
-          <w:szCs w:val="30"/>
-          <w:lang w:val="ru-BY"/>
-        </w:rPr>
-        <w:t>ГУФиТ</w:t>
-      </w:r>
-      <w:proofErr w:type="spellEnd"/>
-      <w:r>
-        <w:rPr>
-          <w:rFonts w:ascii="Times New Roman" w:hAnsi="Times New Roman" w:cs="Times New Roman"/>
-          <w:sz w:val="30"/>
-          <w:szCs w:val="30"/>
-          <w:lang w:val="ru-BY"/>
-        </w:rPr>
-        <w:t xml:space="preserve"> </w:t>
+        <w:t xml:space="preserve"> уточняет у бухгалтера ГУФиТ </w:t>
       </w:r>
       <w:r>
         <w:rPr>
@@ -3562,7 +2934,6 @@
         </w:rPr>
         <w:t xml:space="preserve">ли оформить служебную записку на передачу другому </w:t>
       </w:r>
-      <w:proofErr w:type="spellStart"/>
       <w:r>
         <w:rPr>
           <w:rFonts w:ascii="Times New Roman" w:hAnsi="Times New Roman" w:cs="Times New Roman"/>
@@ -3579,17 +2950,7 @@
           <w:szCs w:val="30"/>
           <w:lang w:val="ru-BY"/>
         </w:rPr>
-        <w:t>у</w:t>
-      </w:r>
-      <w:proofErr w:type="spellEnd"/>
-      <w:r>
-        <w:rPr>
-          <w:rFonts w:ascii="Times New Roman" w:hAnsi="Times New Roman" w:cs="Times New Roman"/>
-          <w:sz w:val="30"/>
-          <w:szCs w:val="30"/>
-          <w:lang w:val="ru-BY"/>
-        </w:rPr>
-        <w:t xml:space="preserve"> </w:t>
+        <w:t xml:space="preserve">у </w:t>
       </w:r>
       <w:r>
         <w:rPr>
@@ -3644,7 +3005,6 @@
         </w:rPr>
         <w:t>4.2. С</w:t>
       </w:r>
-      <w:proofErr w:type="spellStart"/>
       <w:r>
         <w:rPr>
           <w:rFonts w:ascii="Times New Roman" w:hAnsi="Times New Roman" w:cs="Times New Roman"/>
@@ -3659,16 +3019,7 @@
           <w:sz w:val="30"/>
           <w:szCs w:val="30"/>
         </w:rPr>
-        <w:t>здает</w:t>
-      </w:r>
-      <w:proofErr w:type="spellEnd"/>
-      <w:r>
-        <w:rPr>
-          <w:rFonts w:ascii="Times New Roman" w:hAnsi="Times New Roman" w:cs="Times New Roman"/>
-          <w:sz w:val="30"/>
-          <w:szCs w:val="30"/>
-        </w:rPr>
-        <w:t xml:space="preserve"> посредством программы проект электронного акта</w:t>
+        <w:t>здает посредством программы проект электронного акта</w:t>
       </w:r>
       <w:r>
         <w:rPr>
@@ -3846,19 +3197,9 @@
           <w:szCs w:val="30"/>
           <w:lang w:val="ru-BY"/>
         </w:rPr>
-        <w:t xml:space="preserve">в </w:t>
-      </w:r>
-      <w:proofErr w:type="spellStart"/>
-      <w:r>
-        <w:rPr>
-          <w:rFonts w:ascii="Times New Roman" w:hAnsi="Times New Roman" w:cs="Times New Roman"/>
-          <w:sz w:val="30"/>
-          <w:szCs w:val="30"/>
-          <w:lang w:val="ru-BY"/>
-        </w:rPr>
-        <w:t>ГУФиТ</w:t>
-      </w:r>
-      <w:proofErr w:type="spellEnd"/>
+        <w:lastRenderedPageBreak/>
+        <w:t>в ГУФиТ</w:t>
+      </w:r>
       <w:r>
         <w:rPr>
           <w:rFonts w:ascii="Times New Roman" w:hAnsi="Times New Roman" w:cs="Times New Roman"/>
@@ -3874,27 +3215,7 @@
           <w:szCs w:val="30"/>
           <w:lang w:val="ru-BY"/>
         </w:rPr>
-        <w:t xml:space="preserve">После возвращения бумажного экземпляра акта из </w:t>
-      </w:r>
-      <w:proofErr w:type="spellStart"/>
-      <w:r>
-        <w:rPr>
-          <w:rFonts w:ascii="Times New Roman" w:hAnsi="Times New Roman" w:cs="Times New Roman"/>
-          <w:sz w:val="30"/>
-          <w:szCs w:val="30"/>
-          <w:lang w:val="ru-BY"/>
-        </w:rPr>
-        <w:t>ГУФиТ</w:t>
-      </w:r>
-      <w:proofErr w:type="spellEnd"/>
-      <w:r>
-        <w:rPr>
-          <w:rFonts w:ascii="Times New Roman" w:hAnsi="Times New Roman" w:cs="Times New Roman"/>
-          <w:sz w:val="30"/>
-          <w:szCs w:val="30"/>
-          <w:lang w:val="ru-BY"/>
-        </w:rPr>
-        <w:t xml:space="preserve"> дополняет в программе проект электронного акта реквизитами: номер акта и дата акта. После добавления реквизитов акт блокируется для редактирования</w:t>
+        <w:t>После возвращения бумажного экземпляра акта из ГУФиТ дополняет в программе проект электронного акта реквизитами: номер акта и дата акта. После добавления реквизитов акт блокируется для редактирования</w:t>
       </w:r>
       <w:r>
         <w:rPr>
@@ -3997,7 +3318,6 @@
           <w:szCs w:val="30"/>
           <w:lang w:val="ru-BY"/>
         </w:rPr>
-        <w:lastRenderedPageBreak/>
         <w:t>4.3.</w:t>
       </w:r>
       <w:r>
@@ -4209,19 +3529,125 @@
           <w:szCs w:val="30"/>
           <w:lang w:val="ru-BY"/>
         </w:rPr>
-        <w:t xml:space="preserve">в </w:t>
-      </w:r>
-      <w:proofErr w:type="spellStart"/>
-      <w:r>
-        <w:rPr>
-          <w:rFonts w:ascii="Times New Roman" w:hAnsi="Times New Roman" w:cs="Times New Roman"/>
-          <w:sz w:val="30"/>
-          <w:szCs w:val="30"/>
-          <w:lang w:val="ru-BY"/>
-        </w:rPr>
-        <w:t>ГУФиТ</w:t>
-      </w:r>
-      <w:proofErr w:type="spellEnd"/>
+        <w:t>в ГУФиТ.</w:t>
+      </w:r>
+      <w:r>
+        <w:rPr>
+          <w:rFonts w:ascii="Times New Roman" w:hAnsi="Times New Roman" w:cs="Times New Roman"/>
+          <w:sz w:val="30"/>
+          <w:szCs w:val="30"/>
+          <w:lang w:val="ru-BY"/>
+        </w:rPr>
+        <w:t xml:space="preserve"> </w:t>
+      </w:r>
+      <w:r>
+        <w:rPr>
+          <w:rFonts w:ascii="Times New Roman" w:hAnsi="Times New Roman" w:cs="Times New Roman"/>
+          <w:sz w:val="30"/>
+          <w:szCs w:val="30"/>
+          <w:lang w:val="ru-BY"/>
+        </w:rPr>
+        <w:t xml:space="preserve">После </w:t>
+      </w:r>
+      <w:r>
+        <w:rPr>
+          <w:rFonts w:ascii="Times New Roman" w:hAnsi="Times New Roman" w:cs="Times New Roman"/>
+          <w:sz w:val="30"/>
+          <w:szCs w:val="30"/>
+          <w:lang w:val="ru-BY"/>
+        </w:rPr>
+        <w:t>получения бумажных накладных</w:t>
+      </w:r>
+      <w:r>
+        <w:rPr>
+          <w:rFonts w:ascii="Times New Roman" w:hAnsi="Times New Roman" w:cs="Times New Roman"/>
+          <w:sz w:val="30"/>
+          <w:szCs w:val="30"/>
+          <w:lang w:val="ru-BY"/>
+        </w:rPr>
+        <w:t xml:space="preserve"> из ГУФиТ</w:t>
+      </w:r>
+      <w:r>
+        <w:rPr>
+          <w:rFonts w:ascii="Times New Roman" w:hAnsi="Times New Roman" w:cs="Times New Roman"/>
+          <w:sz w:val="30"/>
+          <w:szCs w:val="30"/>
+          <w:lang w:val="ru-BY"/>
+        </w:rPr>
+        <w:t xml:space="preserve"> и фактической передачи реагентов (материалов) другому МОЛу (водителю)</w:t>
+      </w:r>
+      <w:r>
+        <w:rPr>
+          <w:rFonts w:ascii="Times New Roman" w:hAnsi="Times New Roman" w:cs="Times New Roman"/>
+          <w:sz w:val="30"/>
+          <w:szCs w:val="30"/>
+          <w:lang w:val="ru-BY"/>
+        </w:rPr>
+        <w:t xml:space="preserve"> дополняет в программе </w:t>
+      </w:r>
+      <w:r>
+        <w:rPr>
+          <w:rFonts w:ascii="Times New Roman" w:hAnsi="Times New Roman" w:cs="Times New Roman"/>
+          <w:sz w:val="30"/>
+          <w:szCs w:val="30"/>
+          <w:lang w:val="ru-BY"/>
+        </w:rPr>
+        <w:t xml:space="preserve">блок информации о передаче </w:t>
+      </w:r>
+      <w:r>
+        <w:rPr>
+          <w:rFonts w:ascii="Times New Roman" w:hAnsi="Times New Roman" w:cs="Times New Roman"/>
+          <w:sz w:val="30"/>
+          <w:szCs w:val="30"/>
+          <w:lang w:val="ru-BY"/>
+        </w:rPr>
+        <w:t>реквизитами</w:t>
+      </w:r>
+      <w:r>
+        <w:rPr>
+          <w:rFonts w:ascii="Times New Roman" w:hAnsi="Times New Roman" w:cs="Times New Roman"/>
+          <w:sz w:val="30"/>
+          <w:szCs w:val="30"/>
+          <w:lang w:val="ru-BY"/>
+        </w:rPr>
+        <w:t xml:space="preserve"> накладной</w:t>
+      </w:r>
+      <w:r>
+        <w:rPr>
+          <w:rFonts w:ascii="Times New Roman" w:hAnsi="Times New Roman" w:cs="Times New Roman"/>
+          <w:sz w:val="30"/>
+          <w:szCs w:val="30"/>
+          <w:lang w:val="ru-BY"/>
+        </w:rPr>
+        <w:t xml:space="preserve">: номер </w:t>
+      </w:r>
+      <w:r>
+        <w:rPr>
+          <w:rFonts w:ascii="Times New Roman" w:hAnsi="Times New Roman" w:cs="Times New Roman"/>
+          <w:sz w:val="30"/>
+          <w:szCs w:val="30"/>
+          <w:lang w:val="ru-BY"/>
+        </w:rPr>
+        <w:t>накладной</w:t>
+      </w:r>
+      <w:r>
+        <w:rPr>
+          <w:rFonts w:ascii="Times New Roman" w:hAnsi="Times New Roman" w:cs="Times New Roman"/>
+          <w:sz w:val="30"/>
+          <w:szCs w:val="30"/>
+          <w:lang w:val="ru-BY"/>
+        </w:rPr>
+        <w:t xml:space="preserve"> и дата </w:t>
+      </w:r>
+      <w:r>
+        <w:rPr>
+          <w:rFonts w:ascii="Times New Roman" w:hAnsi="Times New Roman" w:cs="Times New Roman"/>
+          <w:sz w:val="30"/>
+          <w:szCs w:val="30"/>
+          <w:lang w:val="ru-BY"/>
+        </w:rPr>
+        <w:t>накладной</w:t>
+      </w:r>
       <w:r>
         <w:rPr>
           <w:rFonts w:ascii="Times New Roman" w:hAnsi="Times New Roman" w:cs="Times New Roman"/>
@@ -4247,110 +3673,7 @@
           <w:szCs w:val="30"/>
           <w:lang w:val="ru-BY"/>
         </w:rPr>
-        <w:t xml:space="preserve">После </w:t>
-      </w:r>
-      <w:r>
-        <w:rPr>
-          <w:rFonts w:ascii="Times New Roman" w:hAnsi="Times New Roman" w:cs="Times New Roman"/>
-          <w:sz w:val="30"/>
-          <w:szCs w:val="30"/>
-          <w:lang w:val="ru-BY"/>
-        </w:rPr>
-        <w:t>получения бумажных накладных</w:t>
-      </w:r>
-      <w:r>
-        <w:rPr>
-          <w:rFonts w:ascii="Times New Roman" w:hAnsi="Times New Roman" w:cs="Times New Roman"/>
-          <w:sz w:val="30"/>
-          <w:szCs w:val="30"/>
-          <w:lang w:val="ru-BY"/>
-        </w:rPr>
-        <w:t xml:space="preserve"> из </w:t>
-      </w:r>
-      <w:proofErr w:type="spellStart"/>
-      <w:r>
-        <w:rPr>
-          <w:rFonts w:ascii="Times New Roman" w:hAnsi="Times New Roman" w:cs="Times New Roman"/>
-          <w:sz w:val="30"/>
-          <w:szCs w:val="30"/>
-          <w:lang w:val="ru-BY"/>
-        </w:rPr>
-        <w:t>ГУФиТ</w:t>
-      </w:r>
-      <w:proofErr w:type="spellEnd"/>
-      <w:r>
-        <w:rPr>
-          <w:rFonts w:ascii="Times New Roman" w:hAnsi="Times New Roman" w:cs="Times New Roman"/>
-          <w:sz w:val="30"/>
-          <w:szCs w:val="30"/>
-          <w:lang w:val="ru-BY"/>
-        </w:rPr>
-        <w:t xml:space="preserve"> и фактической передачи реагентов (материалов) другому </w:t>
-      </w:r>
-      <w:proofErr w:type="spellStart"/>
-      <w:r>
-        <w:rPr>
-          <w:rFonts w:ascii="Times New Roman" w:hAnsi="Times New Roman" w:cs="Times New Roman"/>
-          <w:sz w:val="30"/>
-          <w:szCs w:val="30"/>
-          <w:lang w:val="ru-BY"/>
-        </w:rPr>
-        <w:t>МОЛу</w:t>
-      </w:r>
-      <w:proofErr w:type="spellEnd"/>
-      <w:r>
-        <w:rPr>
-          <w:rFonts w:ascii="Times New Roman" w:hAnsi="Times New Roman" w:cs="Times New Roman"/>
-          <w:sz w:val="30"/>
-          <w:szCs w:val="30"/>
-          <w:lang w:val="ru-BY"/>
-        </w:rPr>
-        <w:t xml:space="preserve"> (водителю)</w:t>
-      </w:r>
-      <w:r>
-        <w:rPr>
-          <w:rFonts w:ascii="Times New Roman" w:hAnsi="Times New Roman" w:cs="Times New Roman"/>
-          <w:sz w:val="30"/>
-          <w:szCs w:val="30"/>
-          <w:lang w:val="ru-BY"/>
-        </w:rPr>
-        <w:t xml:space="preserve"> дополняет в программе </w:t>
-      </w:r>
-      <w:r>
-        <w:rPr>
-          <w:rFonts w:ascii="Times New Roman" w:hAnsi="Times New Roman" w:cs="Times New Roman"/>
-          <w:sz w:val="30"/>
-          <w:szCs w:val="30"/>
-          <w:lang w:val="ru-BY"/>
-        </w:rPr>
-        <w:t xml:space="preserve">блок информации о передаче </w:t>
-      </w:r>
-      <w:r>
-        <w:rPr>
-          <w:rFonts w:ascii="Times New Roman" w:hAnsi="Times New Roman" w:cs="Times New Roman"/>
-          <w:sz w:val="30"/>
-          <w:szCs w:val="30"/>
-          <w:lang w:val="ru-BY"/>
-        </w:rPr>
-        <w:t>реквизитами</w:t>
-      </w:r>
-      <w:r>
-        <w:rPr>
-          <w:rFonts w:ascii="Times New Roman" w:hAnsi="Times New Roman" w:cs="Times New Roman"/>
-          <w:sz w:val="30"/>
-          <w:szCs w:val="30"/>
-          <w:lang w:val="ru-BY"/>
-        </w:rPr>
-        <w:t xml:space="preserve"> накладной</w:t>
-      </w:r>
-      <w:r>
-        <w:rPr>
-          <w:rFonts w:ascii="Times New Roman" w:hAnsi="Times New Roman" w:cs="Times New Roman"/>
-          <w:sz w:val="30"/>
-          <w:szCs w:val="30"/>
-          <w:lang w:val="ru-BY"/>
-        </w:rPr>
-        <w:t xml:space="preserve">: номер </w:t>
+        <w:t xml:space="preserve">После добавления реквизитов </w:t>
       </w:r>
       <w:r>
         <w:rPr>
@@ -4368,25 +3691,34 @@
           <w:szCs w:val="30"/>
           <w:lang w:val="ru-BY"/>
         </w:rPr>
-        <w:t xml:space="preserve"> и дата </w:t>
-      </w:r>
-      <w:r>
-        <w:rPr>
-          <w:rFonts w:ascii="Times New Roman" w:hAnsi="Times New Roman" w:cs="Times New Roman"/>
-          <w:sz w:val="30"/>
-          <w:szCs w:val="30"/>
-          <w:lang w:val="ru-BY"/>
-        </w:rPr>
-        <w:t>накладной</w:t>
-      </w:r>
-      <w:r>
-        <w:rPr>
-          <w:rFonts w:ascii="Times New Roman" w:hAnsi="Times New Roman" w:cs="Times New Roman"/>
-          <w:sz w:val="30"/>
-          <w:szCs w:val="30"/>
-          <w:lang w:val="ru-BY"/>
-        </w:rPr>
-        <w:t>.</w:t>
+        <w:t xml:space="preserve"> выполняется пересчет бухгалтерского остатка реагента</w:t>
+      </w:r>
+      <w:r>
+        <w:rPr>
+          <w:rFonts w:ascii="Times New Roman" w:hAnsi="Times New Roman" w:cs="Times New Roman"/>
+          <w:sz w:val="30"/>
+          <w:szCs w:val="30"/>
+          <w:lang w:val="ru-BY"/>
+        </w:rPr>
+        <w:t xml:space="preserve"> в передающем и получающем подразделении</w:t>
+      </w:r>
+      <w:r>
+        <w:rPr>
+          <w:rFonts w:ascii="Times New Roman" w:hAnsi="Times New Roman" w:cs="Times New Roman"/>
+          <w:sz w:val="30"/>
+          <w:szCs w:val="30"/>
+          <w:lang w:val="ru-BY"/>
+        </w:rPr>
+        <w:br/>
+      </w:r>
+      <w:r>
+        <w:rPr>
+          <w:rFonts w:ascii="Times New Roman" w:hAnsi="Times New Roman" w:cs="Times New Roman"/>
+          <w:sz w:val="30"/>
+          <w:szCs w:val="30"/>
+          <w:lang w:val="ru-BY"/>
+        </w:rPr>
+        <w:t>(и у</w:t>
       </w:r>
       <w:r>
         <w:rPr>
@@ -4404,69 +3736,6 @@
           <w:szCs w:val="30"/>
           <w:lang w:val="ru-BY"/>
         </w:rPr>
-        <w:t xml:space="preserve">После добавления реквизитов </w:t>
-      </w:r>
-      <w:r>
-        <w:rPr>
-          <w:rFonts w:ascii="Times New Roman" w:hAnsi="Times New Roman" w:cs="Times New Roman"/>
-          <w:sz w:val="30"/>
-          <w:szCs w:val="30"/>
-          <w:lang w:val="ru-BY"/>
-        </w:rPr>
-        <w:t>накладной</w:t>
-      </w:r>
-      <w:r>
-        <w:rPr>
-          <w:rFonts w:ascii="Times New Roman" w:hAnsi="Times New Roman" w:cs="Times New Roman"/>
-          <w:sz w:val="30"/>
-          <w:szCs w:val="30"/>
-          <w:lang w:val="ru-BY"/>
-        </w:rPr>
-        <w:t xml:space="preserve"> выполняется пересчет бухгалтерского остатка реагента</w:t>
-      </w:r>
-      <w:r>
-        <w:rPr>
-          <w:rFonts w:ascii="Times New Roman" w:hAnsi="Times New Roman" w:cs="Times New Roman"/>
-          <w:sz w:val="30"/>
-          <w:szCs w:val="30"/>
-          <w:lang w:val="ru-BY"/>
-        </w:rPr>
-        <w:t xml:space="preserve"> в передающем и получающем подразделении</w:t>
-      </w:r>
-      <w:r>
-        <w:rPr>
-          <w:rFonts w:ascii="Times New Roman" w:hAnsi="Times New Roman" w:cs="Times New Roman"/>
-          <w:sz w:val="30"/>
-          <w:szCs w:val="30"/>
-          <w:lang w:val="ru-BY"/>
-        </w:rPr>
-        <w:br/>
-      </w:r>
-      <w:r>
-        <w:rPr>
-          <w:rFonts w:ascii="Times New Roman" w:hAnsi="Times New Roman" w:cs="Times New Roman"/>
-          <w:sz w:val="30"/>
-          <w:szCs w:val="30"/>
-          <w:lang w:val="ru-BY"/>
-        </w:rPr>
-        <w:t>(и у</w:t>
-      </w:r>
-      <w:r>
-        <w:rPr>
-          <w:rFonts w:ascii="Times New Roman" w:hAnsi="Times New Roman" w:cs="Times New Roman"/>
-          <w:sz w:val="30"/>
-          <w:szCs w:val="30"/>
-          <w:lang w:val="ru-BY"/>
-        </w:rPr>
-        <w:t xml:space="preserve"> </w:t>
-      </w:r>
-      <w:r>
-        <w:rPr>
-          <w:rFonts w:ascii="Times New Roman" w:hAnsi="Times New Roman" w:cs="Times New Roman"/>
-          <w:sz w:val="30"/>
-          <w:szCs w:val="30"/>
-          <w:lang w:val="ru-BY"/>
-        </w:rPr>
         <w:t>соответствующих</w:t>
       </w:r>
       <w:r>
@@ -4476,17 +3745,7 @@
           <w:szCs w:val="30"/>
           <w:lang w:val="ru-BY"/>
         </w:rPr>
-        <w:t xml:space="preserve"> </w:t>
-      </w:r>
-      <w:proofErr w:type="spellStart"/>
-      <w:r>
-        <w:rPr>
-          <w:rFonts w:ascii="Times New Roman" w:hAnsi="Times New Roman" w:cs="Times New Roman"/>
-          <w:sz w:val="30"/>
-          <w:szCs w:val="30"/>
-          <w:lang w:val="ru-BY"/>
-        </w:rPr>
-        <w:t>МОЛ</w:t>
+        <w:t xml:space="preserve"> МОЛ</w:t>
       </w:r>
       <w:r>
         <w:rPr>
@@ -4497,7 +3756,6 @@
         </w:rPr>
         <w:t>ов</w:t>
       </w:r>
-      <w:proofErr w:type="spellEnd"/>
       <w:r>
         <w:rPr>
           <w:rFonts w:ascii="Times New Roman" w:hAnsi="Times New Roman" w:cs="Times New Roman"/>
@@ -5238,6 +4496,7 @@
           <w:sz w:val="30"/>
           <w:szCs w:val="30"/>
         </w:rPr>
+        <w:lastRenderedPageBreak/>
         <w:t xml:space="preserve">2) карточка ТМЦ объединяет в себя несколько партий поступления однотипного товара (допускается товар с различной единицей измерения), включает в себя минимум </w:t>
       </w:r>
       <w:r>
@@ -5247,27 +4506,7 @@
           <w:szCs w:val="30"/>
           <w:highlight w:val="yellow"/>
         </w:rPr>
-        <w:t xml:space="preserve">3 раздела – информация от </w:t>
-      </w:r>
-      <w:proofErr w:type="spellStart"/>
-      <w:r>
-        <w:rPr>
-          <w:rFonts w:ascii="Times New Roman" w:hAnsi="Times New Roman" w:cs="Times New Roman"/>
-          <w:sz w:val="30"/>
-          <w:szCs w:val="30"/>
-          <w:highlight w:val="yellow"/>
-        </w:rPr>
-        <w:t>ГУФиТ</w:t>
-      </w:r>
-      <w:proofErr w:type="spellEnd"/>
-      <w:r>
-        <w:rPr>
-          <w:rFonts w:ascii="Times New Roman" w:hAnsi="Times New Roman" w:cs="Times New Roman"/>
-          <w:sz w:val="30"/>
-          <w:szCs w:val="30"/>
-          <w:highlight w:val="yellow"/>
-        </w:rPr>
-        <w:t xml:space="preserve"> (приход на баланс), информация МОЛ (расход со склада), информация пользователя (продление сроков хранения реактивов и т.п.):</w:t>
+        <w:t>3 раздела – информация от ГУФиТ (приход на баланс), информация МОЛ (расход со склада), информация пользователя (продление сроков хранения реактивов и т.п.):</w:t>
       </w:r>
     </w:p>
     <w:p>
@@ -5288,7 +4527,6 @@
           <w:szCs w:val="30"/>
           <w:highlight w:val="yellow"/>
         </w:rPr>
-        <w:lastRenderedPageBreak/>
         <w:t>раздел 1 – приход на баланс (номенклатурный номер, ТМЦ, единица измерения, цена поступления, количество, дата поставки, МОЛ);</w:t>
       </w:r>
     </w:p>
@@ -5328,61 +4566,7 @@
           <w:sz w:val="30"/>
           <w:szCs w:val="30"/>
         </w:rPr>
-        <w:t xml:space="preserve">раздел 3 – информация пользователя (например, производитель, степень чистоты реактива, дата изготовления, дата гарантированного первичного хранения, место хранения в экспертном подразделении, для каких экспертных методик используется, методика контроля годности, дата </w:t>
-      </w:r>
-      <w:proofErr w:type="spellStart"/>
-      <w:r>
-        <w:rPr>
-          <w:rFonts w:ascii="Times New Roman" w:hAnsi="Times New Roman" w:cs="Times New Roman"/>
-          <w:sz w:val="30"/>
-          <w:szCs w:val="30"/>
-        </w:rPr>
-        <w:t>ретеста</w:t>
-      </w:r>
-      <w:proofErr w:type="spellEnd"/>
-      <w:r>
-        <w:rPr>
-          <w:rFonts w:ascii="Times New Roman" w:hAnsi="Times New Roman" w:cs="Times New Roman"/>
-          <w:sz w:val="30"/>
-          <w:szCs w:val="30"/>
-        </w:rPr>
-        <w:t xml:space="preserve">, дата следующего </w:t>
-      </w:r>
-      <w:proofErr w:type="spellStart"/>
-      <w:r>
-        <w:rPr>
-          <w:rFonts w:ascii="Times New Roman" w:hAnsi="Times New Roman" w:cs="Times New Roman"/>
-          <w:sz w:val="30"/>
-          <w:szCs w:val="30"/>
-        </w:rPr>
-        <w:t>ретеста</w:t>
-      </w:r>
-      <w:proofErr w:type="spellEnd"/>
-      <w:r>
-        <w:rPr>
-          <w:rFonts w:ascii="Times New Roman" w:hAnsi="Times New Roman" w:cs="Times New Roman"/>
-          <w:sz w:val="30"/>
-          <w:szCs w:val="30"/>
-        </w:rPr>
-        <w:t xml:space="preserve">, исполнитель </w:t>
-      </w:r>
-      <w:proofErr w:type="spellStart"/>
-      <w:r>
-        <w:rPr>
-          <w:rFonts w:ascii="Times New Roman" w:hAnsi="Times New Roman" w:cs="Times New Roman"/>
-          <w:sz w:val="30"/>
-          <w:szCs w:val="30"/>
-        </w:rPr>
-        <w:t>ретеста</w:t>
-      </w:r>
-      <w:proofErr w:type="spellEnd"/>
-      <w:r>
-        <w:rPr>
-          <w:rFonts w:ascii="Times New Roman" w:hAnsi="Times New Roman" w:cs="Times New Roman"/>
-          <w:sz w:val="30"/>
-          <w:szCs w:val="30"/>
-        </w:rPr>
-        <w:t>, результат контроля и заключение о годности, примечание);</w:t>
+        <w:t>раздел 3 – информация пользователя (например, производитель, степень чистоты реактива, дата изготовления, дата гарантированного первичного хранения, место хранения в экспертном подразделении, для каких экспертных методик используется, методика контроля годности, дата ретеста, дата следующего ретеста, исполнитель ретеста, результат контроля и заключение о годности, примечание);</w:t>
       </w:r>
     </w:p>
     <w:p>
@@ -5401,61 +4585,7 @@
           <w:sz w:val="30"/>
           <w:szCs w:val="30"/>
         </w:rPr>
-        <w:t xml:space="preserve">3) аналитический модуль – формирует из различных единиц измерения единую </w:t>
-      </w:r>
-      <w:proofErr w:type="spellStart"/>
-      <w:r>
-        <w:rPr>
-          <w:rFonts w:ascii="Times New Roman" w:hAnsi="Times New Roman" w:cs="Times New Roman"/>
-          <w:sz w:val="30"/>
-          <w:szCs w:val="30"/>
-        </w:rPr>
-        <w:t>дискрету</w:t>
-      </w:r>
-      <w:proofErr w:type="spellEnd"/>
-      <w:r>
-        <w:rPr>
-          <w:rFonts w:ascii="Times New Roman" w:hAnsi="Times New Roman" w:cs="Times New Roman"/>
-          <w:sz w:val="30"/>
-          <w:szCs w:val="30"/>
-        </w:rPr>
-        <w:t xml:space="preserve">, например, из упаковок и т.п. – штуки, килограммы, граммы, литры, миллилитры и т.п.; формирует общее количество </w:t>
-      </w:r>
-      <w:proofErr w:type="spellStart"/>
-      <w:r>
-        <w:rPr>
-          <w:rFonts w:ascii="Times New Roman" w:hAnsi="Times New Roman" w:cs="Times New Roman"/>
-          <w:sz w:val="30"/>
-          <w:szCs w:val="30"/>
-        </w:rPr>
-        <w:t>дискреты</w:t>
-      </w:r>
-      <w:proofErr w:type="spellEnd"/>
-      <w:r>
-        <w:rPr>
-          <w:rFonts w:ascii="Times New Roman" w:hAnsi="Times New Roman" w:cs="Times New Roman"/>
-          <w:sz w:val="30"/>
-          <w:szCs w:val="30"/>
-        </w:rPr>
-        <w:t xml:space="preserve">, скорость расхода </w:t>
-      </w:r>
-      <w:proofErr w:type="spellStart"/>
-      <w:r>
-        <w:rPr>
-          <w:rFonts w:ascii="Times New Roman" w:hAnsi="Times New Roman" w:cs="Times New Roman"/>
-          <w:sz w:val="30"/>
-          <w:szCs w:val="30"/>
-        </w:rPr>
-        <w:t>дискреты</w:t>
-      </w:r>
-      <w:proofErr w:type="spellEnd"/>
-      <w:r>
-        <w:rPr>
-          <w:rFonts w:ascii="Times New Roman" w:hAnsi="Times New Roman" w:cs="Times New Roman"/>
-          <w:sz w:val="30"/>
-          <w:szCs w:val="30"/>
-        </w:rPr>
-        <w:t xml:space="preserve"> в единицу времени (месяц, полугодие, год), необходимость приобретения ТМЦ, например, </w:t>
+        <w:t xml:space="preserve">3) аналитический модуль – формирует из различных единиц измерения единую дискрету, например, из упаковок и т.п. – штуки, килограммы, граммы, литры, миллилитры и т.п.; формирует общее количество дискреты, скорость расхода дискреты в единицу времени (месяц, полугодие, год), необходимость приобретения ТМЦ, например, </w:t>
       </w:r>
     </w:p>
     <w:p>
@@ -6975,6 +6105,7 @@
   <w:style w:type="character" w:default="1" w:styleId="a0">
     <w:name w:val="Default Paragraph Font"/>
     <w:uiPriority w:val="1"/>
+    <w:semiHidden/>
     <w:unhideWhenUsed/>
   </w:style>
   <w:style w:type="table" w:default="1" w:styleId="a1">

</xml_diff>